<commit_message>
AgentDev: 7 tools built and tested
</commit_message>
<xml_diff>
--- a/DM2026-Lab1-Master-Questions.docx
+++ b/DM2026-Lab1-Master-Questions.docx
@@ -1054,7 +1054,21 @@
         <w:rPr>
           <w:rFonts w:ascii="Century Schoolbook" w:hAnsi="Century Schoolbook"/>
         </w:rPr>
-        <w:t xml:space="preserve"> or leave it blank only if you truly did not use AI for that question. References are still encouraged if you looked anything up.</w:t>
+        <w:t xml:space="preserve"> or leave it blank only if you truly did not use AI for that question. References are still encouraged if you </w:t>
+      </w:r>
+      <w:proofErr w:type="gramStart"/>
+      <w:r>
+        <w:rPr>
+          <w:rFonts w:ascii="Century Schoolbook" w:hAnsi="Century Schoolbook"/>
+        </w:rPr>
+        <w:t>looked</w:t>
+      </w:r>
+      <w:proofErr w:type="gramEnd"/>
+      <w:r>
+        <w:rPr>
+          <w:rFonts w:ascii="Century Schoolbook" w:hAnsi="Century Schoolbook"/>
+        </w:rPr>
+        <w:t xml:space="preserve"> anything up.</w:t>
       </w:r>
     </w:p>
     <w:p>
@@ -1543,13 +1557,23 @@
         </w:rPr>
         <w:t xml:space="preserve"> Section 4.1 — Question 2 (take home) (after the </w:t>
       </w:r>
-      <w:r>
-        <w:rPr>
-          <w:rFonts w:ascii="Century Schoolbook" w:hAnsi="Century Schoolbook"/>
-          <w:b/>
-          <w:bCs/>
-        </w:rPr>
-        <w:t>dropna()</w:t>
+      <w:proofErr w:type="gramStart"/>
+      <w:r>
+        <w:rPr>
+          <w:rFonts w:ascii="Century Schoolbook" w:hAnsi="Century Schoolbook"/>
+          <w:b/>
+          <w:bCs/>
+        </w:rPr>
+        <w:t>dropna(</w:t>
+      </w:r>
+      <w:proofErr w:type="gramEnd"/>
+      <w:r>
+        <w:rPr>
+          <w:rFonts w:ascii="Century Schoolbook" w:hAnsi="Century Schoolbook"/>
+          <w:b/>
+          <w:bCs/>
+        </w:rPr>
+        <w:t>)</w:t>
       </w:r>
       <w:r>
         <w:rPr>
@@ -1586,6 +1610,7 @@
         <w:t xml:space="preserve">In Section 4.1, a dummy record with a missing value is injected and then removed using the </w:t>
       </w:r>
       <w:proofErr w:type="spellStart"/>
+      <w:proofErr w:type="gramStart"/>
       <w:r>
         <w:rPr>
           <w:rFonts w:ascii="Century Schoolbook" w:hAnsi="Century Schoolbook"/>
@@ -1601,7 +1626,16 @@
           <w:b/>
           <w:bCs/>
         </w:rPr>
-        <w:t>()</w:t>
+        <w:t>(</w:t>
+      </w:r>
+      <w:proofErr w:type="gramEnd"/>
+      <w:r>
+        <w:rPr>
+          <w:rFonts w:ascii="Century Schoolbook" w:hAnsi="Century Schoolbook"/>
+          <w:b/>
+          <w:bCs/>
+        </w:rPr>
+        <w:t>)</w:t>
       </w:r>
       <w:r>
         <w:rPr>
@@ -1654,6 +1688,7 @@
         <w:t xml:space="preserve">with </w:t>
       </w:r>
       <w:proofErr w:type="spellStart"/>
+      <w:proofErr w:type="gramStart"/>
       <w:r>
         <w:rPr>
           <w:rFonts w:ascii="Century Schoolbook" w:hAnsi="Century Schoolbook"/>
@@ -1669,7 +1704,16 @@
           <w:b/>
           <w:bCs/>
         </w:rPr>
-        <w:t>()</w:t>
+        <w:t>(</w:t>
+      </w:r>
+      <w:proofErr w:type="gramEnd"/>
+      <w:r>
+        <w:rPr>
+          <w:rFonts w:ascii="Century Schoolbook" w:hAnsi="Century Schoolbook"/>
+          <w:b/>
+          <w:bCs/>
+        </w:rPr>
+        <w:t>)</w:t>
       </w:r>
       <w:r>
         <w:rPr>
@@ -2036,11 +2080,19 @@
         <w:t>“</w:t>
       </w:r>
       <w:proofErr w:type="spellStart"/>
+      <w:proofErr w:type="gramStart"/>
       <w:r>
         <w:rPr>
           <w:rFonts w:ascii="Century Schoolbook" w:hAnsi="Century Schoolbook" w:hint="eastAsia"/>
         </w:rPr>
-        <w:t>soc.religion.christian</w:t>
+        <w:t>soc.religion</w:t>
+      </w:r>
+      <w:proofErr w:type="gramEnd"/>
+      <w:r>
+        <w:rPr>
+          <w:rFonts w:ascii="Century Schoolbook" w:hAnsi="Century Schoolbook" w:hint="eastAsia"/>
+        </w:rPr>
+        <w:t>.christian</w:t>
       </w:r>
       <w:proofErr w:type="spellEnd"/>
       <w:r>
@@ -2068,6 +2120,7 @@
         <w:t>“</w:t>
       </w:r>
       <w:proofErr w:type="spellStart"/>
+      <w:proofErr w:type="gramStart"/>
       <w:r>
         <w:rPr>
           <w:rFonts w:ascii="Century Schoolbook" w:hAnsi="Century Schoolbook" w:hint="eastAsia"/>
@@ -2075,6 +2128,7 @@
         <w:t>alt.athesim</w:t>
       </w:r>
       <w:proofErr w:type="spellEnd"/>
+      <w:proofErr w:type="gramEnd"/>
       <w:r>
         <w:rPr>
           <w:rFonts w:ascii="Century Schoolbook" w:hAnsi="Century Schoolbook"/>
@@ -2518,7 +2572,21 @@
         <w:rPr>
           <w:rFonts w:ascii="Century Schoolbook" w:hAnsi="Century Schoolbook" w:hint="eastAsia"/>
         </w:rPr>
-        <w:t>=None, the number  increased to 35788.</w:t>
+        <w:t xml:space="preserve">=None, the </w:t>
+      </w:r>
+      <w:proofErr w:type="gramStart"/>
+      <w:r>
+        <w:rPr>
+          <w:rFonts w:ascii="Century Schoolbook" w:hAnsi="Century Schoolbook" w:hint="eastAsia"/>
+        </w:rPr>
+        <w:t>number  increased</w:t>
+      </w:r>
+      <w:proofErr w:type="gramEnd"/>
+      <w:r>
+        <w:rPr>
+          <w:rFonts w:ascii="Century Schoolbook" w:hAnsi="Century Schoolbook" w:hint="eastAsia"/>
+        </w:rPr>
+        <w:t xml:space="preserve"> to 35788.</w:t>
       </w:r>
     </w:p>
     <w:p>
@@ -2530,52 +2598,80 @@
         </w:numPr>
         <w:jc w:val="both"/>
         <w:rPr>
+          <w:rFonts w:ascii="Century Schoolbook" w:hAnsi="Century Schoolbook"/>
+        </w:rPr>
+      </w:pPr>
+      <w:r>
+        <w:rPr>
           <w:rFonts w:ascii="Century Schoolbook" w:hAnsi="Century Schoolbook" w:hint="eastAsia"/>
         </w:rPr>
-      </w:pPr>
+        <w:t xml:space="preserve">Determiners (the, a, an) and </w:t>
+      </w:r>
+      <w:r>
+        <w:rPr>
+          <w:rFonts w:ascii="Century Schoolbook" w:hAnsi="Century Schoolbook"/>
+        </w:rPr>
+        <w:t>grammatical</w:t>
+      </w:r>
       <w:r>
         <w:rPr>
           <w:rFonts w:ascii="Century Schoolbook" w:hAnsi="Century Schoolbook" w:hint="eastAsia"/>
         </w:rPr>
-        <w:t xml:space="preserve">Determiners (the, a, an) and </w:t>
-      </w:r>
-      <w:r>
-        <w:rPr>
-          <w:rFonts w:ascii="Century Schoolbook" w:hAnsi="Century Schoolbook"/>
-        </w:rPr>
-        <w:t>grammatical</w:t>
+        <w:t xml:space="preserve"> words (</w:t>
+      </w:r>
+      <w:r>
+        <w:rPr>
+          <w:rFonts w:ascii="Century Schoolbook" w:hAnsi="Century Schoolbook"/>
+        </w:rPr>
+        <w:t>auxiliaries</w:t>
       </w:r>
       <w:r>
         <w:rPr>
           <w:rFonts w:ascii="Century Schoolbook" w:hAnsi="Century Schoolbook" w:hint="eastAsia"/>
         </w:rPr>
-        <w:t xml:space="preserve"> words (</w:t>
-      </w:r>
-      <w:r>
-        <w:rPr>
-          <w:rFonts w:ascii="Century Schoolbook" w:hAnsi="Century Schoolbook"/>
-        </w:rPr>
-        <w:t>auxiliaries</w:t>
-      </w:r>
+        <w:t xml:space="preserve">, pronouns, </w:t>
+      </w:r>
+      <w:proofErr w:type="spellStart"/>
       <w:r>
         <w:rPr>
           <w:rFonts w:ascii="Century Schoolbook" w:hAnsi="Century Schoolbook" w:hint="eastAsia"/>
         </w:rPr>
-        <w:t xml:space="preserve">, pronouns, </w:t>
-      </w:r>
-      <w:proofErr w:type="spellStart"/>
+        <w:t>etc</w:t>
+      </w:r>
+      <w:proofErr w:type="spellEnd"/>
       <w:r>
         <w:rPr>
           <w:rFonts w:ascii="Century Schoolbook" w:hAnsi="Century Schoolbook" w:hint="eastAsia"/>
         </w:rPr>
-        <w:t>etc</w:t>
-      </w:r>
-      <w:proofErr w:type="spellEnd"/>
+        <w:t>) will end up taking the top-</w:t>
+      </w:r>
+      <w:proofErr w:type="gramStart"/>
       <w:r>
         <w:rPr>
           <w:rFonts w:ascii="Century Schoolbook" w:hAnsi="Century Schoolbook" w:hint="eastAsia"/>
         </w:rPr>
-        <w:t>) will end up taking the top-n common words after adding them back. This causes the matrix show less significant information.</w:t>
+        <w:t>n common words</w:t>
+      </w:r>
+      <w:proofErr w:type="gramEnd"/>
+      <w:r>
+        <w:rPr>
+          <w:rFonts w:ascii="Century Schoolbook" w:hAnsi="Century Schoolbook" w:hint="eastAsia"/>
+        </w:rPr>
+        <w:t xml:space="preserve"> after adding them back. This causes the matrix </w:t>
+      </w:r>
+      <w:proofErr w:type="gramStart"/>
+      <w:r>
+        <w:rPr>
+          <w:rFonts w:ascii="Century Schoolbook" w:hAnsi="Century Schoolbook" w:hint="eastAsia"/>
+        </w:rPr>
+        <w:t>show</w:t>
+      </w:r>
+      <w:proofErr w:type="gramEnd"/>
+      <w:r>
+        <w:rPr>
+          <w:rFonts w:ascii="Century Schoolbook" w:hAnsi="Century Schoolbook" w:hint="eastAsia"/>
+        </w:rPr>
+        <w:t xml:space="preserve"> less significant information.</w:t>
       </w:r>
     </w:p>
     <w:p>
@@ -2885,9 +2981,15 @@
       </w:r>
       <w:r>
         <w:rPr>
+          <w:rFonts w:ascii="Century Schoolbook" w:hAnsi="Century Schoolbook"/>
+        </w:rPr>
+        <w:t>strictly</w:t>
+      </w:r>
+      <w:r>
+        <w:rPr>
           <w:rFonts w:ascii="Century Schoolbook" w:hAnsi="Century Schoolbook" w:hint="eastAsia"/>
         </w:rPr>
-        <w:t>does not change.</w:t>
+        <w:t xml:space="preserve"> decreased. </w:t>
       </w:r>
     </w:p>
     <w:p>
@@ -2994,7 +3096,7 @@
         <w:rPr>
           <w:rFonts w:ascii="Century Schoolbook" w:hAnsi="Century Schoolbook" w:hint="eastAsia"/>
         </w:rPr>
-        <w:t xml:space="preserve">. They might be product code, surnames, usernames, as the dataset contains email </w:t>
+        <w:t xml:space="preserve">. They might be product code, surnames, usernames, as the dataset contains </w:t>
       </w:r>
       <w:r>
         <w:rPr>
@@ -3006,7 +3108,37 @@
         <w:rPr>
           <w:rFonts w:ascii="Century Schoolbook" w:hAnsi="Century Schoolbook" w:hint="eastAsia"/>
         </w:rPr>
-        <w:t xml:space="preserve">s. </w:t>
+        <w:t>s</w:t>
+      </w:r>
+      <w:r>
+        <w:rPr>
+          <w:rFonts w:ascii="Century Schoolbook" w:hAnsi="Century Schoolbook" w:hint="eastAsia"/>
+        </w:rPr>
+        <w:t xml:space="preserve"> in forum</w:t>
+      </w:r>
+      <w:r>
+        <w:rPr>
+          <w:rFonts w:ascii="Century Schoolbook" w:hAnsi="Century Schoolbook" w:hint="eastAsia"/>
+        </w:rPr>
+        <w:t xml:space="preserve">. </w:t>
+      </w:r>
+      <w:r>
+        <w:rPr>
+          <w:rFonts w:ascii="Century Schoolbook" w:hAnsi="Century Schoolbook" w:hint="eastAsia"/>
+        </w:rPr>
+        <w:t xml:space="preserve">Their variance is 0.000443, which means that they only appear once in the whole 2257 </w:t>
+      </w:r>
+      <w:r>
+        <w:rPr>
+          <w:rFonts w:ascii="Century Schoolbook" w:hAnsi="Century Schoolbook"/>
+        </w:rPr>
+        <w:t>piece</w:t>
+      </w:r>
+      <w:r>
+        <w:rPr>
+          <w:rFonts w:ascii="Century Schoolbook" w:hAnsi="Century Schoolbook" w:hint="eastAsia"/>
+        </w:rPr>
+        <w:t xml:space="preserve"> of data.</w:t>
       </w:r>
     </w:p>
     <w:p>
@@ -3018,32 +3150,50 @@
         </w:numPr>
         <w:jc w:val="both"/>
         <w:rPr>
+          <w:rFonts w:ascii="Century Schoolbook" w:hAnsi="Century Schoolbook"/>
+        </w:rPr>
+      </w:pPr>
+      <w:r>
+        <w:rPr>
           <w:rFonts w:ascii="Century Schoolbook" w:hAnsi="Century Schoolbook" w:hint="eastAsia"/>
         </w:rPr>
-      </w:pPr>
+        <w:t>Removing near-zero variance features does not cause harm to analysis because the number of those features in each piece of data does not vary significantly,</w:t>
+      </w:r>
       <w:r>
         <w:rPr>
           <w:rFonts w:ascii="Century Schoolbook" w:hAnsi="Century Schoolbook" w:hint="eastAsia"/>
         </w:rPr>
-        <w:t>Removing near-zero variance features does not cause harm to analysis because the number of those features in each piece of data does not vary significantly,</w:t>
+        <w:t xml:space="preserve"> meaning that it</w:t>
+      </w:r>
+      <w:r>
+        <w:rPr>
+          <w:rFonts w:ascii="Century Schoolbook" w:hAnsi="Century Schoolbook"/>
+        </w:rPr>
+        <w:t>’</w:t>
       </w:r>
       <w:r>
         <w:rPr>
           <w:rFonts w:ascii="Century Schoolbook" w:hAnsi="Century Schoolbook" w:hint="eastAsia"/>
         </w:rPr>
-        <w:t xml:space="preserve"> meaning that it</w:t>
-      </w:r>
-      <w:r>
-        <w:rPr>
-          <w:rFonts w:ascii="Century Schoolbook" w:hAnsi="Century Schoolbook"/>
-        </w:rPr>
-        <w:t>’</w:t>
+        <w:t xml:space="preserve">s hard to determine the data </w:t>
+      </w:r>
+      <w:r>
+        <w:rPr>
+          <w:rFonts w:ascii="Century Schoolbook" w:hAnsi="Century Schoolbook"/>
+        </w:rPr>
+        <w:t>categories</w:t>
       </w:r>
       <w:r>
         <w:rPr>
           <w:rFonts w:ascii="Century Schoolbook" w:hAnsi="Century Schoolbook" w:hint="eastAsia"/>
         </w:rPr>
-        <w:t>s hard to determine the data types from them.</w:t>
+        <w:t xml:space="preserve"> </w:t>
+      </w:r>
+      <w:r>
+        <w:rPr>
+          <w:rFonts w:ascii="Century Schoolbook" w:hAnsi="Century Schoolbook" w:hint="eastAsia"/>
+        </w:rPr>
+        <w:t>from them.</w:t>
       </w:r>
     </w:p>
     <w:tbl>
@@ -3186,6 +3336,7 @@
               <w:rPr>
                 <w:rFonts w:ascii="Century Schoolbook" w:hAnsi="Century Schoolbook"/>
               </w:rPr>
+              <w:lastRenderedPageBreak/>
               <w:t>0.01</w:t>
             </w:r>
           </w:p>
@@ -3233,7 +3384,6 @@
               <w:rPr>
                 <w:rFonts w:ascii="Century Schoolbook" w:hAnsi="Century Schoolbook"/>
               </w:rPr>
-              <w:lastRenderedPageBreak/>
               <w:t>0.05</w:t>
             </w:r>
           </w:p>
@@ -3397,6 +3547,7 @@
         <w:t xml:space="preserve">Run the correlation filter against the binary indicator for the </w:t>
       </w:r>
       <w:proofErr w:type="spellStart"/>
+      <w:proofErr w:type="gramStart"/>
       <w:r>
         <w:rPr>
           <w:rFonts w:ascii="Century Schoolbook" w:hAnsi="Century Schoolbook"/>
@@ -3406,6 +3557,7 @@
         <w:t>comp.graphics</w:t>
       </w:r>
       <w:proofErr w:type="spellEnd"/>
+      <w:proofErr w:type="gramEnd"/>
       <w:r>
         <w:rPr>
           <w:rFonts w:ascii="Century Schoolbook" w:hAnsi="Century Schoolbook"/>
@@ -3466,8 +3618,13 @@
         <w:pStyle w:val="a9"/>
         <w:numPr>
           <w:ilvl w:val="1"/>
-          <w:numId w:val="7"/>
+          <w:numId w:val="26"/>
         </w:numPr>
+        <w:tabs>
+          <w:tab w:val="clear" w:pos="1440"/>
+          <w:tab w:val="num" w:pos="709"/>
+        </w:tabs>
+        <w:ind w:left="709" w:hanging="425"/>
         <w:jc w:val="both"/>
         <w:rPr>
           <w:rFonts w:ascii="Century Schoolbook" w:hAnsi="Century Schoolbook"/>
@@ -3485,8 +3642,13 @@
         <w:pStyle w:val="a9"/>
         <w:numPr>
           <w:ilvl w:val="1"/>
-          <w:numId w:val="7"/>
+          <w:numId w:val="26"/>
         </w:numPr>
+        <w:tabs>
+          <w:tab w:val="clear" w:pos="1440"/>
+          <w:tab w:val="num" w:pos="709"/>
+        </w:tabs>
+        <w:ind w:left="709" w:hanging="425"/>
         <w:jc w:val="both"/>
         <w:rPr>
           <w:rFonts w:ascii="Century Schoolbook" w:hAnsi="Century Schoolbook"/>
@@ -3532,8 +3694,13 @@
         <w:pStyle w:val="a9"/>
         <w:numPr>
           <w:ilvl w:val="1"/>
-          <w:numId w:val="7"/>
+          <w:numId w:val="26"/>
         </w:numPr>
+        <w:tabs>
+          <w:tab w:val="clear" w:pos="1440"/>
+          <w:tab w:val="num" w:pos="709"/>
+        </w:tabs>
+        <w:ind w:left="709" w:hanging="425"/>
         <w:jc w:val="both"/>
         <w:rPr>
           <w:rFonts w:ascii="Century Schoolbook" w:hAnsi="Century Schoolbook"/>
@@ -3579,6 +3746,8 @@
         <w:jc w:val="both"/>
         <w:rPr>
           <w:rFonts w:ascii="Century Schoolbook" w:hAnsi="Century Schoolbook"/>
+          <w:b/>
+          <w:bCs/>
         </w:rPr>
       </w:pPr>
       <w:r>
@@ -3592,31 +3761,329 @@
     </w:p>
     <w:p>
       <w:pPr>
-        <w:jc w:val="both"/>
-        <w:rPr>
-          <w:rFonts w:ascii="Century Schoolbook" w:hAnsi="Century Schoolbook"/>
-        </w:rPr>
-      </w:pPr>
-      <w:r>
-        <w:rPr>
-          <w:rFonts w:ascii="Century Schoolbook" w:hAnsi="Century Schoolbook"/>
-          <w:b/>
-          <w:bCs/>
-        </w:rPr>
+        <w:pStyle w:val="a9"/>
+        <w:numPr>
+          <w:ilvl w:val="0"/>
+          <w:numId w:val="27"/>
+        </w:numPr>
+        <w:jc w:val="both"/>
+        <w:rPr>
+          <w:rFonts w:ascii="Century Schoolbook" w:hAnsi="Century Schoolbook" w:hint="eastAsia"/>
+        </w:rPr>
+      </w:pPr>
+      <w:r>
+        <w:rPr>
+          <w:rFonts w:ascii="Century Schoolbook" w:hAnsi="Century Schoolbook" w:hint="eastAsia"/>
+        </w:rPr>
+        <w:t>In Pearson, the top-correlated words include common non-stop words (thanks, hi, looking, people</w:t>
+      </w:r>
+      <w:r>
+        <w:rPr>
+          <w:rFonts w:ascii="Century Schoolbook" w:hAnsi="Century Schoolbook"/>
+        </w:rPr>
+        <w:t>…</w:t>
+      </w:r>
+      <w:r>
+        <w:rPr>
+          <w:rFonts w:ascii="Century Schoolbook" w:hAnsi="Century Schoolbook" w:hint="eastAsia"/>
+        </w:rPr>
+        <w:t>) while those in Spearman</w:t>
+      </w:r>
+      <w:r>
+        <w:rPr>
+          <w:rFonts w:ascii="Century Schoolbook" w:hAnsi="Century Schoolbook" w:hint="eastAsia"/>
+        </w:rPr>
+        <w:t xml:space="preserve"> starts from</w:t>
+      </w:r>
+      <w:r>
+        <w:t xml:space="preserve"> </w:t>
+      </w:r>
+      <w:r>
+        <w:rPr>
+          <w:rFonts w:ascii="Century Schoolbook" w:hAnsi="Century Schoolbook"/>
+        </w:rPr>
+        <w:t>graphics</w:t>
+      </w:r>
+      <w:r>
+        <w:rPr>
+          <w:rFonts w:ascii="Century Schoolbook" w:hAnsi="Century Schoolbook" w:hint="eastAsia"/>
+        </w:rPr>
+        <w:t>, people, files, image</w:t>
+      </w:r>
+      <w:r>
+        <w:rPr>
+          <w:rFonts w:ascii="Century Schoolbook" w:hAnsi="Century Schoolbook" w:hint="eastAsia"/>
+        </w:rPr>
+        <w:t xml:space="preserve">, </w:t>
+      </w:r>
+      <w:proofErr w:type="gramStart"/>
+      <w:r>
+        <w:rPr>
+          <w:rFonts w:ascii="Century Schoolbook" w:hAnsi="Century Schoolbook" w:hint="eastAsia"/>
+        </w:rPr>
+        <w:t>god</w:t>
+      </w:r>
+      <w:proofErr w:type="gramEnd"/>
+      <w:r>
+        <w:rPr>
+          <w:rFonts w:ascii="Century Schoolbook" w:hAnsi="Century Schoolbook" w:hint="eastAsia"/>
+        </w:rPr>
+        <w:t>, 3d, etc. From the results, it can be found that the proportion of domain-specific term increases.</w:t>
+      </w:r>
+      <w:r>
+        <w:rPr>
+          <w:rFonts w:ascii="Century Schoolbook" w:hAnsi="Century Schoolbook" w:hint="eastAsia"/>
+        </w:rPr>
+        <w:t xml:space="preserve"> </w:t>
+      </w:r>
+    </w:p>
+    <w:p>
+      <w:pPr>
+        <w:jc w:val="both"/>
+        <w:rPr>
+          <w:rFonts w:ascii="Century Schoolbook" w:hAnsi="Century Schoolbook" w:hint="eastAsia"/>
+        </w:rPr>
+      </w:pPr>
+      <w:r>
+        <w:rPr>
+          <w:rFonts w:ascii="Century Schoolbook" w:hAnsi="Century Schoolbook" w:hint="eastAsia"/>
+        </w:rPr>
+        <w:t>2.</w:t>
+      </w:r>
+      <w:r>
+        <w:rPr>
+          <w:rFonts w:ascii="Century Schoolbook" w:hAnsi="Century Schoolbook" w:hint="eastAsia"/>
+        </w:rPr>
+        <w:t xml:space="preserve"> </w:t>
+      </w:r>
+      <w:r>
+        <w:rPr>
+          <w:rFonts w:ascii="Century Schoolbook" w:hAnsi="Century Schoolbook" w:hint="eastAsia"/>
+        </w:rPr>
+        <w:t xml:space="preserve">Pearson uses raw values and </w:t>
+      </w:r>
+      <w:proofErr w:type="gramStart"/>
+      <w:r>
+        <w:rPr>
+          <w:rFonts w:ascii="Century Schoolbook" w:hAnsi="Century Schoolbook" w:hint="eastAsia"/>
+        </w:rPr>
+        <w:t>calculate</w:t>
+      </w:r>
+      <w:proofErr w:type="gramEnd"/>
+      <w:r>
+        <w:rPr>
+          <w:rFonts w:ascii="Century Schoolbook" w:hAnsi="Century Schoolbook" w:hint="eastAsia"/>
+        </w:rPr>
+        <w:t xml:space="preserve"> linear relation, whereas Spearman changes the values into ranking and compares the numbers without considering the difference </w:t>
+      </w:r>
+      <w:r>
+        <w:rPr>
+          <w:rFonts w:ascii="Century Schoolbook" w:hAnsi="Century Schoolbook"/>
+        </w:rPr>
+        <w:t>magnitude</w:t>
+      </w:r>
+      <w:r>
+        <w:rPr>
+          <w:rFonts w:ascii="Century Schoolbook" w:hAnsi="Century Schoolbook" w:hint="eastAsia"/>
+        </w:rPr>
+        <w:t>.</w:t>
+      </w:r>
+    </w:p>
+    <w:p>
+      <w:pPr>
+        <w:jc w:val="both"/>
+        <w:rPr>
+          <w:rFonts w:ascii="Century Schoolbook" w:hAnsi="Century Schoolbook" w:hint="eastAsia"/>
+        </w:rPr>
+      </w:pPr>
+      <w:r>
+        <w:rPr>
+          <w:rFonts w:ascii="Century Schoolbook" w:hAnsi="Century Schoolbook" w:hint="eastAsia"/>
+          <w:highlight w:val="yellow"/>
+        </w:rPr>
+        <w:t>3.</w:t>
+      </w:r>
+      <w:r>
+        <w:rPr>
+          <w:rFonts w:ascii="Century Schoolbook" w:hAnsi="Century Schoolbook" w:hint="eastAsia"/>
+          <w:highlight w:val="yellow"/>
+        </w:rPr>
+        <w:t xml:space="preserve"> </w:t>
+      </w:r>
+      <w:r>
+        <w:rPr>
+          <w:rFonts w:ascii="Century Schoolbook" w:hAnsi="Century Schoolbook" w:hint="eastAsia"/>
+          <w:highlight w:val="yellow"/>
+        </w:rPr>
+        <w:t xml:space="preserve">In the scenario that a word </w:t>
+      </w:r>
+      <w:r>
+        <w:rPr>
+          <w:rFonts w:ascii="Century Schoolbook" w:hAnsi="Century Schoolbook"/>
+          <w:highlight w:val="yellow"/>
+        </w:rPr>
+        <w:t>has</w:t>
+      </w:r>
+      <w:r>
+        <w:rPr>
+          <w:rFonts w:ascii="Century Schoolbook" w:hAnsi="Century Schoolbook" w:hint="eastAsia"/>
+          <w:highlight w:val="yellow"/>
+        </w:rPr>
+        <w:t xml:space="preserve"> specifically high </w:t>
+      </w:r>
+      <w:r>
+        <w:rPr>
+          <w:rFonts w:ascii="Century Schoolbook" w:hAnsi="Century Schoolbook"/>
+          <w:highlight w:val="yellow"/>
+        </w:rPr>
+        <w:t>correlation</w:t>
+      </w:r>
+      <w:r>
+        <w:rPr>
+          <w:rFonts w:ascii="Century Schoolbook" w:hAnsi="Century Schoolbook" w:hint="eastAsia"/>
+          <w:highlight w:val="yellow"/>
+        </w:rPr>
+        <w:t xml:space="preserve"> with a topic while </w:t>
+      </w:r>
+      <w:r>
+        <w:rPr>
+          <w:rFonts w:ascii="Century Schoolbook" w:hAnsi="Century Schoolbook"/>
+          <w:highlight w:val="yellow"/>
+        </w:rPr>
+        <w:t>doesn’t</w:t>
+      </w:r>
+      <w:r>
+        <w:rPr>
+          <w:rFonts w:ascii="Century Schoolbook" w:hAnsi="Century Schoolbook" w:hint="eastAsia"/>
+          <w:highlight w:val="yellow"/>
+        </w:rPr>
+        <w:t xml:space="preserve"> share the same relation with others. It will increase Spearman correlation but decrease Pearson. </w:t>
+      </w:r>
+      <w:r>
+        <w:rPr>
+          <w:rFonts w:ascii="Century Schoolbook" w:hAnsi="Century Schoolbook" w:hint="eastAsia"/>
+          <w:highlight w:val="yellow"/>
+        </w:rPr>
+        <w:t xml:space="preserve">From the screenshot below, we can see </w:t>
+      </w:r>
+      <w:r>
+        <w:rPr>
+          <w:rFonts w:ascii="Century Schoolbook" w:hAnsi="Century Schoolbook"/>
+          <w:highlight w:val="yellow"/>
+        </w:rPr>
+        <w:t>“</w:t>
+      </w:r>
+      <w:r>
+        <w:rPr>
+          <w:rFonts w:ascii="Century Schoolbook" w:hAnsi="Century Schoolbook" w:hint="eastAsia"/>
+          <w:highlight w:val="yellow"/>
+        </w:rPr>
+        <w:t>graphics</w:t>
+      </w:r>
+      <w:r>
+        <w:rPr>
+          <w:rFonts w:ascii="Century Schoolbook" w:hAnsi="Century Schoolbook"/>
+          <w:highlight w:val="yellow"/>
+        </w:rPr>
+        <w:t>”</w:t>
+      </w:r>
+      <w:r>
+        <w:rPr>
+          <w:rFonts w:ascii="Century Schoolbook" w:hAnsi="Century Schoolbook" w:hint="eastAsia"/>
+          <w:highlight w:val="yellow"/>
+        </w:rPr>
+        <w:t xml:space="preserve"> appears 105 times in a single article</w:t>
+      </w:r>
+      <w:r>
+        <w:rPr>
+          <w:rFonts w:ascii="Century Schoolbook" w:hAnsi="Century Schoolbook" w:hint="eastAsia"/>
+          <w:highlight w:val="yellow"/>
+        </w:rPr>
+        <w:t>, but most of other articles contains less than 32 times, so from this we can infer that</w:t>
+      </w:r>
+      <w:r>
+        <w:rPr>
+          <w:rFonts w:ascii="Century Schoolbook" w:hAnsi="Century Schoolbook" w:hint="eastAsia"/>
+        </w:rPr>
+        <w:t xml:space="preserve"> </w:t>
+      </w:r>
+    </w:p>
+    <w:p>
+      <w:pPr>
+        <w:jc w:val="both"/>
+        <w:rPr>
+          <w:rFonts w:ascii="Century Schoolbook" w:hAnsi="Century Schoolbook" w:hint="eastAsia"/>
+        </w:rPr>
+      </w:pPr>
+      <w:r>
+        <w:rPr>
+          <w:rFonts w:ascii="Century Schoolbook" w:hAnsi="Century Schoolbook"/>
+        </w:rPr>
+        <w:drawing>
+          <wp:inline distT="0" distB="0" distL="0" distR="0" wp14:anchorId="52DCFA8E" wp14:editId="757B74DF">
+            <wp:extent cx="2888343" cy="1457612"/>
+            <wp:effectExtent l="0" t="0" r="7620" b="9525"/>
+            <wp:docPr id="315925833" name="圖片 1"/>
+            <wp:cNvGraphicFramePr>
+              <a:graphicFrameLocks xmlns:a="http://schemas.openxmlformats.org/drawingml/2006/main" noChangeAspect="1"/>
+            </wp:cNvGraphicFramePr>
+            <a:graphic xmlns:a="http://schemas.openxmlformats.org/drawingml/2006/main">
+              <a:graphicData uri="http://schemas.openxmlformats.org/drawingml/2006/picture">
+                <pic:pic xmlns:pic="http://schemas.openxmlformats.org/drawingml/2006/picture">
+                  <pic:nvPicPr>
+                    <pic:cNvPr id="315925833" name=""/>
+                    <pic:cNvPicPr/>
+                  </pic:nvPicPr>
+                  <pic:blipFill>
+                    <a:blip r:embed="rId7"/>
+                    <a:stretch>
+                      <a:fillRect/>
+                    </a:stretch>
+                  </pic:blipFill>
+                  <pic:spPr>
+                    <a:xfrm>
+                      <a:off x="0" y="0"/>
+                      <a:ext cx="2897032" cy="1461997"/>
+                    </a:xfrm>
+                    <a:prstGeom prst="rect">
+                      <a:avLst/>
+                    </a:prstGeom>
+                  </pic:spPr>
+                </pic:pic>
+              </a:graphicData>
+            </a:graphic>
+          </wp:inline>
+        </w:drawing>
+      </w:r>
+    </w:p>
+    <w:p>
+      <w:pPr>
+        <w:jc w:val="both"/>
+        <w:rPr>
+          <w:rFonts w:ascii="Century Schoolbook" w:hAnsi="Century Schoolbook"/>
+        </w:rPr>
+      </w:pPr>
+      <w:r>
+        <w:rPr>
+          <w:rFonts w:ascii="Century Schoolbook" w:hAnsi="Century Schoolbook"/>
+          <w:b/>
+          <w:bCs/>
+        </w:rPr>
+        <w:lastRenderedPageBreak/>
         <w:t>AI used for this answer:</w:t>
       </w:r>
       <w:r>
         <w:rPr>
           <w:rFonts w:ascii="Century Schoolbook" w:hAnsi="Century Schoolbook"/>
         </w:rPr>
-        <w:t xml:space="preserve"> Yes / No </w:t>
-      </w:r>
-    </w:p>
-    <w:p>
-      <w:pPr>
-        <w:jc w:val="both"/>
-        <w:rPr>
-          <w:rFonts w:ascii="Century Schoolbook" w:hAnsi="Century Schoolbook"/>
+        <w:t xml:space="preserve"> Yes </w:t>
+      </w:r>
+    </w:p>
+    <w:p>
+      <w:pPr>
+        <w:jc w:val="both"/>
+        <w:rPr>
+          <w:rFonts w:ascii="Century Schoolbook" w:hAnsi="Century Schoolbook" w:hint="eastAsia"/>
         </w:rPr>
       </w:pPr>
       <w:r>
@@ -3632,6 +4099,42 @@
           <w:rFonts w:ascii="Century Schoolbook" w:hAnsi="Century Schoolbook"/>
         </w:rPr>
         <w:t xml:space="preserve"> </w:t>
+      </w:r>
+      <w:r>
+        <w:rPr>
+          <w:rFonts w:ascii="Century Schoolbook" w:hAnsi="Century Schoolbook" w:hint="eastAsia"/>
+        </w:rPr>
+        <w:t>I ask AI for Pearson and Spearman methods explanation</w:t>
+      </w:r>
+      <w:r>
+        <w:rPr>
+          <w:rFonts w:ascii="Century Schoolbook" w:hAnsi="Century Schoolbook" w:hint="eastAsia"/>
+        </w:rPr>
+        <w:t xml:space="preserve"> and help me write additional cell code to support my answer</w:t>
+      </w:r>
+      <w:r>
+        <w:rPr>
+          <w:rFonts w:ascii="Century Schoolbook" w:hAnsi="Century Schoolbook" w:hint="eastAsia"/>
+        </w:rPr>
+        <w:t xml:space="preserve">, but the answer </w:t>
+      </w:r>
+      <w:r>
+        <w:rPr>
+          <w:rFonts w:ascii="Century Schoolbook" w:hAnsi="Century Schoolbook"/>
+        </w:rPr>
+        <w:t>writing</w:t>
+      </w:r>
+      <w:r>
+        <w:rPr>
+          <w:rFonts w:ascii="Century Schoolbook" w:hAnsi="Century Schoolbook" w:hint="eastAsia"/>
+        </w:rPr>
+        <w:t xml:space="preserve"> is</w:t>
+      </w:r>
+      <w:r>
+        <w:rPr>
+          <w:rFonts w:ascii="Century Schoolbook" w:hAnsi="Century Schoolbook" w:hint="eastAsia"/>
+        </w:rPr>
+        <w:t xml:space="preserve"> by myself.</w:t>
       </w:r>
     </w:p>
     <w:p>
@@ -3747,13 +4250,23 @@
         </w:rPr>
         <w:t xml:space="preserve">In the Frequent Pattern Mining section, run </w:t>
       </w:r>
-      <w:r>
-        <w:rPr>
-          <w:rFonts w:ascii="Century Schoolbook" w:hAnsi="Century Schoolbook"/>
-          <w:b/>
-          <w:bCs/>
-        </w:rPr>
-        <w:t>Top-K FAE</w:t>
+      <w:proofErr w:type="gramStart"/>
+      <w:r>
+        <w:rPr>
+          <w:rFonts w:ascii="Century Schoolbook" w:hAnsi="Century Schoolbook"/>
+          <w:b/>
+          <w:bCs/>
+        </w:rPr>
+        <w:t>Top-K</w:t>
+      </w:r>
+      <w:proofErr w:type="gramEnd"/>
+      <w:r>
+        <w:rPr>
+          <w:rFonts w:ascii="Century Schoolbook" w:hAnsi="Century Schoolbook"/>
+          <w:b/>
+          <w:bCs/>
+        </w:rPr>
+        <w:t xml:space="preserve"> FAE</w:t>
       </w:r>
       <w:r>
         <w:rPr>
@@ -3921,13 +4434,23 @@
         </w:rPr>
         <w:t xml:space="preserve">How does the parameter k in </w:t>
       </w:r>
-      <w:r>
-        <w:rPr>
-          <w:rFonts w:ascii="Century Schoolbook" w:hAnsi="Century Schoolbook"/>
-          <w:b/>
-          <w:bCs/>
-        </w:rPr>
-        <w:t>Top-K FAE</w:t>
+      <w:proofErr w:type="gramStart"/>
+      <w:r>
+        <w:rPr>
+          <w:rFonts w:ascii="Century Schoolbook" w:hAnsi="Century Schoolbook"/>
+          <w:b/>
+          <w:bCs/>
+        </w:rPr>
+        <w:t>Top-K</w:t>
+      </w:r>
+      <w:proofErr w:type="gramEnd"/>
+      <w:r>
+        <w:rPr>
+          <w:rFonts w:ascii="Century Schoolbook" w:hAnsi="Century Schoolbook"/>
+          <w:b/>
+          <w:bCs/>
+        </w:rPr>
+        <w:t xml:space="preserve"> FAE</w:t>
       </w:r>
       <w:r>
         <w:rPr>
@@ -4000,7 +4523,25 @@
           <w:b/>
           <w:bCs/>
         </w:rPr>
-        <w:t xml:space="preserve">Answer (1) — Runtime and pattern count when lowering </w:t>
+        <w:t>Answer (</w:t>
+      </w:r>
+      <w:proofErr w:type="gramStart"/>
+      <w:r>
+        <w:rPr>
+          <w:rFonts w:ascii="Century Schoolbook" w:hAnsi="Century Schoolbook"/>
+          <w:b/>
+          <w:bCs/>
+        </w:rPr>
+        <w:t>1) —</w:t>
+      </w:r>
+      <w:proofErr w:type="gramEnd"/>
+      <w:r>
+        <w:rPr>
+          <w:rFonts w:ascii="Century Schoolbook" w:hAnsi="Century Schoolbook"/>
+          <w:b/>
+          <w:bCs/>
+        </w:rPr>
+        <w:t xml:space="preserve"> Runtime and pattern count when lowering </w:t>
       </w:r>
       <w:proofErr w:type="spellStart"/>
       <w:r>
@@ -4034,7 +4575,25 @@
           <w:b/>
           <w:bCs/>
         </w:rPr>
-        <w:t xml:space="preserve">Answer (2) — Top-K k vs </w:t>
+        <w:t>Answer (</w:t>
+      </w:r>
+      <w:proofErr w:type="gramStart"/>
+      <w:r>
+        <w:rPr>
+          <w:rFonts w:ascii="Century Schoolbook" w:hAnsi="Century Schoolbook"/>
+          <w:b/>
+          <w:bCs/>
+        </w:rPr>
+        <w:t>2) —</w:t>
+      </w:r>
+      <w:proofErr w:type="gramEnd"/>
+      <w:r>
+        <w:rPr>
+          <w:rFonts w:ascii="Century Schoolbook" w:hAnsi="Century Schoolbook"/>
+          <w:b/>
+          <w:bCs/>
+        </w:rPr>
+        <w:t xml:space="preserve"> Top-K k vs </w:t>
       </w:r>
       <w:proofErr w:type="spellStart"/>
       <w:r>
@@ -4086,8 +4645,25 @@
           <w:b/>
           <w:bCs/>
         </w:rPr>
-        <w:lastRenderedPageBreak/>
-        <w:t>Answer (3) — Maximal vs standard frequent patterns:</w:t>
+        <w:t>Answer (</w:t>
+      </w:r>
+      <w:proofErr w:type="gramStart"/>
+      <w:r>
+        <w:rPr>
+          <w:rFonts w:ascii="Century Schoolbook" w:hAnsi="Century Schoolbook"/>
+          <w:b/>
+          <w:bCs/>
+        </w:rPr>
+        <w:t>3) —</w:t>
+      </w:r>
+      <w:proofErr w:type="gramEnd"/>
+      <w:r>
+        <w:rPr>
+          <w:rFonts w:ascii="Century Schoolbook" w:hAnsi="Century Schoolbook"/>
+          <w:b/>
+          <w:bCs/>
+        </w:rPr>
+        <w:t xml:space="preserve"> Maximal vs standard frequent patterns:</w:t>
       </w:r>
     </w:p>
     <w:p>
@@ -4373,6 +4949,7 @@
           <w:b/>
           <w:bCs/>
         </w:rPr>
+        <w:lastRenderedPageBreak/>
         <w:t>If yes, how:</w:t>
       </w:r>
       <w:r>
@@ -6930,6 +7507,95 @@
     </w:lvl>
   </w:abstractNum>
   <w:abstractNum w:abstractNumId="15" w15:restartNumberingAfterBreak="0">
+    <w:nsid w:val="5ABC1E88"/>
+    <w:multiLevelType w:val="hybridMultilevel"/>
+    <w:tmpl w:val="DBA86A32"/>
+    <w:lvl w:ilvl="0" w:tplc="EC02ABCA">
+      <w:start w:val="1"/>
+      <w:numFmt w:val="decimal"/>
+      <w:lvlText w:val="%1."/>
+      <w:lvlJc w:val="left"/>
+      <w:pPr>
+        <w:ind w:left="360" w:hanging="360"/>
+      </w:pPr>
+      <w:rPr>
+        <w:rFonts w:hint="default"/>
+      </w:rPr>
+    </w:lvl>
+    <w:lvl w:ilvl="1" w:tplc="04090019" w:tentative="1">
+      <w:start w:val="1"/>
+      <w:numFmt w:val="ideographTraditional"/>
+      <w:lvlText w:val="%2、"/>
+      <w:lvlJc w:val="left"/>
+      <w:pPr>
+        <w:ind w:left="960" w:hanging="480"/>
+      </w:pPr>
+    </w:lvl>
+    <w:lvl w:ilvl="2" w:tplc="0409001B" w:tentative="1">
+      <w:start w:val="1"/>
+      <w:numFmt w:val="lowerRoman"/>
+      <w:lvlText w:val="%3."/>
+      <w:lvlJc w:val="right"/>
+      <w:pPr>
+        <w:ind w:left="1440" w:hanging="480"/>
+      </w:pPr>
+    </w:lvl>
+    <w:lvl w:ilvl="3" w:tplc="0409000F" w:tentative="1">
+      <w:start w:val="1"/>
+      <w:numFmt w:val="decimal"/>
+      <w:lvlText w:val="%4."/>
+      <w:lvlJc w:val="left"/>
+      <w:pPr>
+        <w:ind w:left="1920" w:hanging="480"/>
+      </w:pPr>
+    </w:lvl>
+    <w:lvl w:ilvl="4" w:tplc="04090019" w:tentative="1">
+      <w:start w:val="1"/>
+      <w:numFmt w:val="ideographTraditional"/>
+      <w:lvlText w:val="%5、"/>
+      <w:lvlJc w:val="left"/>
+      <w:pPr>
+        <w:ind w:left="2400" w:hanging="480"/>
+      </w:pPr>
+    </w:lvl>
+    <w:lvl w:ilvl="5" w:tplc="0409001B" w:tentative="1">
+      <w:start w:val="1"/>
+      <w:numFmt w:val="lowerRoman"/>
+      <w:lvlText w:val="%6."/>
+      <w:lvlJc w:val="right"/>
+      <w:pPr>
+        <w:ind w:left="2880" w:hanging="480"/>
+      </w:pPr>
+    </w:lvl>
+    <w:lvl w:ilvl="6" w:tplc="0409000F" w:tentative="1">
+      <w:start w:val="1"/>
+      <w:numFmt w:val="decimal"/>
+      <w:lvlText w:val="%7."/>
+      <w:lvlJc w:val="left"/>
+      <w:pPr>
+        <w:ind w:left="3360" w:hanging="480"/>
+      </w:pPr>
+    </w:lvl>
+    <w:lvl w:ilvl="7" w:tplc="04090019" w:tentative="1">
+      <w:start w:val="1"/>
+      <w:numFmt w:val="ideographTraditional"/>
+      <w:lvlText w:val="%8、"/>
+      <w:lvlJc w:val="left"/>
+      <w:pPr>
+        <w:ind w:left="3840" w:hanging="480"/>
+      </w:pPr>
+    </w:lvl>
+    <w:lvl w:ilvl="8" w:tplc="0409001B" w:tentative="1">
+      <w:start w:val="1"/>
+      <w:numFmt w:val="lowerRoman"/>
+      <w:lvlText w:val="%9."/>
+      <w:lvlJc w:val="right"/>
+      <w:pPr>
+        <w:ind w:left="4320" w:hanging="480"/>
+      </w:pPr>
+    </w:lvl>
+  </w:abstractNum>
+  <w:abstractNum w:abstractNumId="16" w15:restartNumberingAfterBreak="0">
     <w:nsid w:val="600745AA"/>
     <w:multiLevelType w:val="hybridMultilevel"/>
     <w:tmpl w:val="7BCE176C"/>
@@ -7069,7 +7735,7 @@
       </w:rPr>
     </w:lvl>
   </w:abstractNum>
-  <w:abstractNum w:abstractNumId="16" w15:restartNumberingAfterBreak="0">
+  <w:abstractNum w:abstractNumId="17" w15:restartNumberingAfterBreak="0">
     <w:nsid w:val="63660093"/>
     <w:multiLevelType w:val="multilevel"/>
     <w:tmpl w:val="487AC5E8"/>
@@ -7182,7 +7848,7 @@
       </w:pPr>
     </w:lvl>
   </w:abstractNum>
-  <w:abstractNum w:abstractNumId="17" w15:restartNumberingAfterBreak="0">
+  <w:abstractNum w:abstractNumId="18" w15:restartNumberingAfterBreak="0">
     <w:nsid w:val="665D4A6D"/>
     <w:multiLevelType w:val="hybridMultilevel"/>
     <w:tmpl w:val="4E2097EA"/>
@@ -7272,7 +7938,7 @@
       </w:pPr>
     </w:lvl>
   </w:abstractNum>
-  <w:abstractNum w:abstractNumId="18" w15:restartNumberingAfterBreak="0">
+  <w:abstractNum w:abstractNumId="19" w15:restartNumberingAfterBreak="0">
     <w:nsid w:val="66633041"/>
     <w:multiLevelType w:val="hybridMultilevel"/>
     <w:tmpl w:val="F3BAEAD8"/>
@@ -7412,7 +8078,7 @@
       </w:rPr>
     </w:lvl>
   </w:abstractNum>
-  <w:abstractNum w:abstractNumId="19" w15:restartNumberingAfterBreak="0">
+  <w:abstractNum w:abstractNumId="20" w15:restartNumberingAfterBreak="0">
     <w:nsid w:val="67445AD2"/>
     <w:multiLevelType w:val="hybridMultilevel"/>
     <w:tmpl w:val="C4DE3054"/>
@@ -7552,7 +8218,7 @@
       </w:rPr>
     </w:lvl>
   </w:abstractNum>
-  <w:abstractNum w:abstractNumId="20" w15:restartNumberingAfterBreak="0">
+  <w:abstractNum w:abstractNumId="21" w15:restartNumberingAfterBreak="0">
     <w:nsid w:val="6E5869E4"/>
     <w:multiLevelType w:val="multilevel"/>
     <w:tmpl w:val="22AC937C"/>
@@ -7665,7 +8331,7 @@
       </w:pPr>
     </w:lvl>
   </w:abstractNum>
-  <w:abstractNum w:abstractNumId="21" w15:restartNumberingAfterBreak="0">
+  <w:abstractNum w:abstractNumId="22" w15:restartNumberingAfterBreak="0">
     <w:nsid w:val="6F90345B"/>
     <w:multiLevelType w:val="multilevel"/>
     <w:tmpl w:val="76CCD152"/>
@@ -7778,7 +8444,7 @@
       </w:pPr>
     </w:lvl>
   </w:abstractNum>
-  <w:abstractNum w:abstractNumId="22" w15:restartNumberingAfterBreak="0">
+  <w:abstractNum w:abstractNumId="23" w15:restartNumberingAfterBreak="0">
     <w:nsid w:val="745C3AEA"/>
     <w:multiLevelType w:val="hybridMultilevel"/>
     <w:tmpl w:val="AB2AF8BA"/>
@@ -7891,7 +8557,7 @@
       </w:rPr>
     </w:lvl>
   </w:abstractNum>
-  <w:abstractNum w:abstractNumId="23" w15:restartNumberingAfterBreak="0">
+  <w:abstractNum w:abstractNumId="24" w15:restartNumberingAfterBreak="0">
     <w:nsid w:val="755D4AD5"/>
     <w:multiLevelType w:val="multilevel"/>
     <w:tmpl w:val="1AF6A79A"/>
@@ -8040,7 +8706,120 @@
       </w:rPr>
     </w:lvl>
   </w:abstractNum>
-  <w:abstractNum w:abstractNumId="24" w15:restartNumberingAfterBreak="0">
+  <w:abstractNum w:abstractNumId="25" w15:restartNumberingAfterBreak="0">
+    <w:nsid w:val="78A22755"/>
+    <w:multiLevelType w:val="multilevel"/>
+    <w:tmpl w:val="76CCD152"/>
+    <w:lvl w:ilvl="0">
+      <w:start w:val="1"/>
+      <w:numFmt w:val="decimal"/>
+      <w:lvlText w:val="%1."/>
+      <w:lvlJc w:val="left"/>
+      <w:pPr>
+        <w:tabs>
+          <w:tab w:val="num" w:pos="720"/>
+        </w:tabs>
+        <w:ind w:left="720" w:hanging="360"/>
+      </w:pPr>
+    </w:lvl>
+    <w:lvl w:ilvl="1">
+      <w:start w:val="1"/>
+      <w:numFmt w:val="decimal"/>
+      <w:lvlText w:val="%2."/>
+      <w:lvlJc w:val="left"/>
+      <w:pPr>
+        <w:tabs>
+          <w:tab w:val="num" w:pos="1440"/>
+        </w:tabs>
+        <w:ind w:left="1440" w:hanging="360"/>
+      </w:pPr>
+    </w:lvl>
+    <w:lvl w:ilvl="2" w:tentative="1">
+      <w:start w:val="1"/>
+      <w:numFmt w:val="decimal"/>
+      <w:lvlText w:val="%3."/>
+      <w:lvlJc w:val="left"/>
+      <w:pPr>
+        <w:tabs>
+          <w:tab w:val="num" w:pos="2160"/>
+        </w:tabs>
+        <w:ind w:left="2160" w:hanging="360"/>
+      </w:pPr>
+    </w:lvl>
+    <w:lvl w:ilvl="3" w:tentative="1">
+      <w:start w:val="1"/>
+      <w:numFmt w:val="decimal"/>
+      <w:lvlText w:val="%4."/>
+      <w:lvlJc w:val="left"/>
+      <w:pPr>
+        <w:tabs>
+          <w:tab w:val="num" w:pos="2880"/>
+        </w:tabs>
+        <w:ind w:left="2880" w:hanging="360"/>
+      </w:pPr>
+    </w:lvl>
+    <w:lvl w:ilvl="4" w:tentative="1">
+      <w:start w:val="1"/>
+      <w:numFmt w:val="decimal"/>
+      <w:lvlText w:val="%5."/>
+      <w:lvlJc w:val="left"/>
+      <w:pPr>
+        <w:tabs>
+          <w:tab w:val="num" w:pos="3600"/>
+        </w:tabs>
+        <w:ind w:left="3600" w:hanging="360"/>
+      </w:pPr>
+    </w:lvl>
+    <w:lvl w:ilvl="5" w:tentative="1">
+      <w:start w:val="1"/>
+      <w:numFmt w:val="decimal"/>
+      <w:lvlText w:val="%6."/>
+      <w:lvlJc w:val="left"/>
+      <w:pPr>
+        <w:tabs>
+          <w:tab w:val="num" w:pos="4320"/>
+        </w:tabs>
+        <w:ind w:left="4320" w:hanging="360"/>
+      </w:pPr>
+    </w:lvl>
+    <w:lvl w:ilvl="6" w:tentative="1">
+      <w:start w:val="1"/>
+      <w:numFmt w:val="decimal"/>
+      <w:lvlText w:val="%7."/>
+      <w:lvlJc w:val="left"/>
+      <w:pPr>
+        <w:tabs>
+          <w:tab w:val="num" w:pos="5040"/>
+        </w:tabs>
+        <w:ind w:left="5040" w:hanging="360"/>
+      </w:pPr>
+    </w:lvl>
+    <w:lvl w:ilvl="7" w:tentative="1">
+      <w:start w:val="1"/>
+      <w:numFmt w:val="decimal"/>
+      <w:lvlText w:val="%8."/>
+      <w:lvlJc w:val="left"/>
+      <w:pPr>
+        <w:tabs>
+          <w:tab w:val="num" w:pos="5760"/>
+        </w:tabs>
+        <w:ind w:left="5760" w:hanging="360"/>
+      </w:pPr>
+    </w:lvl>
+    <w:lvl w:ilvl="8" w:tentative="1">
+      <w:start w:val="1"/>
+      <w:numFmt w:val="decimal"/>
+      <w:lvlText w:val="%9."/>
+      <w:lvlJc w:val="left"/>
+      <w:pPr>
+        <w:tabs>
+          <w:tab w:val="num" w:pos="6480"/>
+        </w:tabs>
+        <w:ind w:left="6480" w:hanging="360"/>
+      </w:pPr>
+    </w:lvl>
+  </w:abstractNum>
+  <w:abstractNum w:abstractNumId="26" w15:restartNumberingAfterBreak="0">
     <w:nsid w:val="7D601873"/>
     <w:multiLevelType w:val="multilevel"/>
     <w:tmpl w:val="6660EE9E"/>
@@ -8199,7 +8978,7 @@
     <w:abstractNumId w:val="0"/>
   </w:num>
   <w:num w:numId="4" w16cid:durableId="731463887">
-    <w:abstractNumId w:val="23"/>
+    <w:abstractNumId w:val="24"/>
   </w:num>
   <w:num w:numId="5" w16cid:durableId="619185889">
     <w:abstractNumId w:val="2"/>
@@ -8208,16 +8987,16 @@
     <w:abstractNumId w:val="5"/>
   </w:num>
   <w:num w:numId="7" w16cid:durableId="1588727719">
-    <w:abstractNumId w:val="21"/>
+    <w:abstractNumId w:val="22"/>
   </w:num>
   <w:num w:numId="8" w16cid:durableId="533738981">
     <w:abstractNumId w:val="8"/>
   </w:num>
   <w:num w:numId="9" w16cid:durableId="1269434050">
-    <w:abstractNumId w:val="20"/>
+    <w:abstractNumId w:val="21"/>
   </w:num>
   <w:num w:numId="10" w16cid:durableId="1732079054">
-    <w:abstractNumId w:val="16"/>
+    <w:abstractNumId w:val="17"/>
   </w:num>
   <w:num w:numId="11" w16cid:durableId="1035348155">
     <w:abstractNumId w:val="10"/>
@@ -8226,10 +9005,10 @@
     <w:abstractNumId w:val="11"/>
   </w:num>
   <w:num w:numId="13" w16cid:durableId="1675378421">
-    <w:abstractNumId w:val="24"/>
+    <w:abstractNumId w:val="26"/>
   </w:num>
   <w:num w:numId="14" w16cid:durableId="815490794">
-    <w:abstractNumId w:val="22"/>
+    <w:abstractNumId w:val="23"/>
   </w:num>
   <w:num w:numId="15" w16cid:durableId="1567035629">
     <w:abstractNumId w:val="3"/>
@@ -8238,10 +9017,10 @@
     <w:abstractNumId w:val="13"/>
   </w:num>
   <w:num w:numId="17" w16cid:durableId="467089125">
-    <w:abstractNumId w:val="15"/>
+    <w:abstractNumId w:val="16"/>
   </w:num>
   <w:num w:numId="18" w16cid:durableId="771702364">
-    <w:abstractNumId w:val="19"/>
+    <w:abstractNumId w:val="20"/>
   </w:num>
   <w:num w:numId="19" w16cid:durableId="893585597">
     <w:abstractNumId w:val="9"/>
@@ -8259,10 +9038,16 @@
     <w:abstractNumId w:val="6"/>
   </w:num>
   <w:num w:numId="24" w16cid:durableId="1413353911">
+    <w:abstractNumId w:val="19"/>
+  </w:num>
+  <w:num w:numId="25" w16cid:durableId="1389036051">
     <w:abstractNumId w:val="18"/>
   </w:num>
-  <w:num w:numId="25" w16cid:durableId="1389036051">
-    <w:abstractNumId w:val="17"/>
+  <w:num w:numId="26" w16cid:durableId="498156938">
+    <w:abstractNumId w:val="25"/>
+  </w:num>
+  <w:num w:numId="27" w16cid:durableId="561797408">
+    <w:abstractNumId w:val="15"/>
   </w:num>
 </w:numbering>
 </file>

</xml_diff>

<commit_message>
Pipeline and homework reports, Master Q5-Q6
</commit_message>
<xml_diff>
--- a/DM2026-Lab1-Master-Questions.docx
+++ b/DM2026-Lab1-Master-Questions.docx
@@ -469,35 +469,7 @@
         <w:rPr>
           <w:rFonts w:ascii="Century Schoolbook" w:hAnsi="Century Schoolbook"/>
         </w:rPr>
-        <w:t xml:space="preserve">Read the task; change parameters when asked (e.g. </w:t>
-      </w:r>
-      <w:proofErr w:type="spellStart"/>
-      <w:r>
-        <w:rPr>
-          <w:rFonts w:ascii="Century Schoolbook" w:hAnsi="Century Schoolbook"/>
-        </w:rPr>
-        <w:t>stop_words</w:t>
-      </w:r>
-      <w:proofErr w:type="spellEnd"/>
-      <w:r>
-        <w:rPr>
-          <w:rFonts w:ascii="Century Schoolbook" w:hAnsi="Century Schoolbook"/>
-        </w:rPr>
-        <w:t xml:space="preserve">, thresholds, k, </w:t>
-      </w:r>
-      <w:proofErr w:type="spellStart"/>
-      <w:r>
-        <w:rPr>
-          <w:rFonts w:ascii="Century Schoolbook" w:hAnsi="Century Schoolbook"/>
-        </w:rPr>
-        <w:t>minSup</w:t>
-      </w:r>
-      <w:proofErr w:type="spellEnd"/>
-      <w:r>
-        <w:rPr>
-          <w:rFonts w:ascii="Century Schoolbook" w:hAnsi="Century Schoolbook"/>
-        </w:rPr>
-        <w:t>).</w:t>
+        <w:t>Read the task; change parameters when asked (e.g. stop_words, thresholds, k, minSup).</w:t>
       </w:r>
     </w:p>
     <w:p>
@@ -1054,21 +1026,7 @@
         <w:rPr>
           <w:rFonts w:ascii="Century Schoolbook" w:hAnsi="Century Schoolbook"/>
         </w:rPr>
-        <w:t xml:space="preserve"> or leave it blank only if you truly did not use AI for that question. References are still encouraged if you </w:t>
-      </w:r>
-      <w:proofErr w:type="gramStart"/>
-      <w:r>
-        <w:rPr>
-          <w:rFonts w:ascii="Century Schoolbook" w:hAnsi="Century Schoolbook"/>
-        </w:rPr>
-        <w:t>looked</w:t>
-      </w:r>
-      <w:proofErr w:type="gramEnd"/>
-      <w:r>
-        <w:rPr>
-          <w:rFonts w:ascii="Century Schoolbook" w:hAnsi="Century Schoolbook"/>
-        </w:rPr>
-        <w:t xml:space="preserve"> anything up.</w:t>
+        <w:t xml:space="preserve"> or leave it blank only if you truly did not use AI for that question. References are still encouraged if you looked anything up.</w:t>
       </w:r>
     </w:p>
     <w:p>
@@ -1282,21 +1240,7 @@
         <w:rPr>
           <w:rFonts w:ascii="Century Schoolbook" w:hAnsi="Century Schoolbook"/>
         </w:rPr>
-        <w:t xml:space="preserve"> Filter the </w:t>
-      </w:r>
-      <w:proofErr w:type="spellStart"/>
-      <w:r>
-        <w:rPr>
-          <w:rFonts w:ascii="Century Schoolbook" w:hAnsi="Century Schoolbook"/>
-        </w:rPr>
-        <w:t>dataframe</w:t>
-      </w:r>
-      <w:proofErr w:type="spellEnd"/>
-      <w:r>
-        <w:rPr>
-          <w:rFonts w:ascii="Century Schoolbook" w:hAnsi="Century Schoolbook"/>
-        </w:rPr>
-        <w:t xml:space="preserve"> </w:t>
+        <w:t xml:space="preserve"> Filter the dataframe </w:t>
       </w:r>
       <w:r>
         <w:rPr>
@@ -1312,7 +1256,6 @@
         </w:rPr>
         <w:t xml:space="preserve"> for the category </w:t>
       </w:r>
-      <w:proofErr w:type="spellStart"/>
       <w:r>
         <w:rPr>
           <w:rFonts w:ascii="Century Schoolbook" w:hAnsi="Century Schoolbook"/>
@@ -1321,7 +1264,6 @@
         </w:rPr>
         <w:t>sci.med</w:t>
       </w:r>
-      <w:proofErr w:type="spellEnd"/>
       <w:r>
         <w:rPr>
           <w:rFonts w:ascii="Century Schoolbook" w:hAnsi="Century Schoolbook"/>
@@ -1557,23 +1499,13 @@
         </w:rPr>
         <w:t xml:space="preserve"> Section 4.1 — Question 2 (take home) (after the </w:t>
       </w:r>
-      <w:proofErr w:type="gramStart"/>
-      <w:r>
-        <w:rPr>
-          <w:rFonts w:ascii="Century Schoolbook" w:hAnsi="Century Schoolbook"/>
-          <w:b/>
-          <w:bCs/>
-        </w:rPr>
-        <w:t>dropna(</w:t>
-      </w:r>
-      <w:proofErr w:type="gramEnd"/>
-      <w:r>
-        <w:rPr>
-          <w:rFonts w:ascii="Century Schoolbook" w:hAnsi="Century Schoolbook"/>
-          <w:b/>
-          <w:bCs/>
-        </w:rPr>
-        <w:t>)</w:t>
+      <w:r>
+        <w:rPr>
+          <w:rFonts w:ascii="Century Schoolbook" w:hAnsi="Century Schoolbook"/>
+          <w:b/>
+          <w:bCs/>
+        </w:rPr>
+        <w:t>dropna()</w:t>
       </w:r>
       <w:r>
         <w:rPr>
@@ -1609,33 +1541,13 @@
         </w:rPr>
         <w:t xml:space="preserve">In Section 4.1, a dummy record with a missing value is injected and then removed using the </w:t>
       </w:r>
-      <w:proofErr w:type="spellStart"/>
-      <w:proofErr w:type="gramStart"/>
-      <w:r>
-        <w:rPr>
-          <w:rFonts w:ascii="Century Schoolbook" w:hAnsi="Century Schoolbook"/>
-          <w:b/>
-          <w:bCs/>
-        </w:rPr>
-        <w:t>dropna</w:t>
-      </w:r>
-      <w:proofErr w:type="spellEnd"/>
-      <w:r>
-        <w:rPr>
-          <w:rFonts w:ascii="Century Schoolbook" w:hAnsi="Century Schoolbook"/>
-          <w:b/>
-          <w:bCs/>
-        </w:rPr>
-        <w:t>(</w:t>
-      </w:r>
-      <w:proofErr w:type="gramEnd"/>
-      <w:r>
-        <w:rPr>
-          <w:rFonts w:ascii="Century Schoolbook" w:hAnsi="Century Schoolbook"/>
-          <w:b/>
-          <w:bCs/>
-        </w:rPr>
-        <w:t>)</w:t>
+      <w:r>
+        <w:rPr>
+          <w:rFonts w:ascii="Century Schoolbook" w:hAnsi="Century Schoolbook"/>
+          <w:b/>
+          <w:bCs/>
+        </w:rPr>
+        <w:t>dropna()</w:t>
       </w:r>
       <w:r>
         <w:rPr>
@@ -1665,7 +1577,6 @@
         </w:rPr>
         <w:t xml:space="preserve"> If 40% of documents were missing the </w:t>
       </w:r>
-      <w:proofErr w:type="spellStart"/>
       <w:r>
         <w:rPr>
           <w:rFonts w:ascii="Century Schoolbook" w:hAnsi="Century Schoolbook"/>
@@ -1674,7 +1585,6 @@
         </w:rPr>
         <w:t>category_name</w:t>
       </w:r>
-      <w:proofErr w:type="spellEnd"/>
       <w:r>
         <w:rPr>
           <w:rFonts w:ascii="Century Schoolbook" w:hAnsi="Century Schoolbook"/>
@@ -1687,33 +1597,13 @@
         </w:rPr>
         <w:t xml:space="preserve">with </w:t>
       </w:r>
-      <w:proofErr w:type="spellStart"/>
-      <w:proofErr w:type="gramStart"/>
-      <w:r>
-        <w:rPr>
-          <w:rFonts w:ascii="Century Schoolbook" w:hAnsi="Century Schoolbook"/>
-          <w:b/>
-          <w:bCs/>
-        </w:rPr>
-        <w:t>dropna</w:t>
-      </w:r>
-      <w:proofErr w:type="spellEnd"/>
-      <w:r>
-        <w:rPr>
-          <w:rFonts w:ascii="Century Schoolbook" w:hAnsi="Century Schoolbook"/>
-          <w:b/>
-          <w:bCs/>
-        </w:rPr>
-        <w:t>(</w:t>
-      </w:r>
-      <w:proofErr w:type="gramEnd"/>
-      <w:r>
-        <w:rPr>
-          <w:rFonts w:ascii="Century Schoolbook" w:hAnsi="Century Schoolbook"/>
-          <w:b/>
-          <w:bCs/>
-        </w:rPr>
-        <w:t>)</w:t>
+      <w:r>
+        <w:rPr>
+          <w:rFonts w:ascii="Century Schoolbook" w:hAnsi="Century Schoolbook"/>
+          <w:b/>
+          <w:bCs/>
+        </w:rPr>
+        <w:t>dropna()</w:t>
       </w:r>
       <w:r>
         <w:rPr>
@@ -1923,41 +1813,13 @@
         </w:rPr>
         <w:t xml:space="preserve">In Section 5.1, the code uses </w:t>
       </w:r>
-      <w:proofErr w:type="spellStart"/>
-      <w:r>
-        <w:rPr>
-          <w:rFonts w:ascii="Century Schoolbook" w:hAnsi="Century Schoolbook"/>
-          <w:b/>
-          <w:bCs/>
-        </w:rPr>
-        <w:t>X_sample</w:t>
-      </w:r>
-      <w:proofErr w:type="spellEnd"/>
-      <w:r>
-        <w:rPr>
-          <w:rFonts w:ascii="Century Schoolbook" w:hAnsi="Century Schoolbook"/>
-          <w:b/>
-          <w:bCs/>
-        </w:rPr>
-        <w:t xml:space="preserve"> = </w:t>
-      </w:r>
-      <w:proofErr w:type="spellStart"/>
-      <w:r>
-        <w:rPr>
-          <w:rFonts w:ascii="Century Schoolbook" w:hAnsi="Century Schoolbook"/>
-          <w:b/>
-          <w:bCs/>
-        </w:rPr>
-        <w:t>X.sample</w:t>
-      </w:r>
-      <w:proofErr w:type="spellEnd"/>
-      <w:r>
-        <w:rPr>
-          <w:rFonts w:ascii="Century Schoolbook" w:hAnsi="Century Schoolbook"/>
-          <w:b/>
-          <w:bCs/>
-        </w:rPr>
-        <w:t>(n=1000)</w:t>
+      <w:r>
+        <w:rPr>
+          <w:rFonts w:ascii="Century Schoolbook" w:hAnsi="Century Schoolbook"/>
+          <w:b/>
+          <w:bCs/>
+        </w:rPr>
+        <w:t>X_sample = X.sample(n=1000)</w:t>
       </w:r>
       <w:r>
         <w:rPr>
@@ -2079,22 +1941,42 @@
         </w:rPr>
         <w:t>“</w:t>
       </w:r>
-      <w:proofErr w:type="spellStart"/>
-      <w:proofErr w:type="gramStart"/>
       <w:r>
         <w:rPr>
           <w:rFonts w:ascii="Century Schoolbook" w:hAnsi="Century Schoolbook" w:hint="eastAsia"/>
         </w:rPr>
-        <w:t>soc.religion</w:t>
-      </w:r>
-      <w:proofErr w:type="gramEnd"/>
+        <w:t>soc.religion.christian</w:t>
+      </w:r>
+      <w:r>
+        <w:rPr>
+          <w:rFonts w:ascii="Century Schoolbook" w:hAnsi="Century Schoolbook"/>
+        </w:rPr>
+        <w:t>”</w:t>
+      </w:r>
       <w:r>
         <w:rPr>
           <w:rFonts w:ascii="Century Schoolbook" w:hAnsi="Century Schoolbook" w:hint="eastAsia"/>
         </w:rPr>
-        <w:t>.christian</w:t>
-      </w:r>
-      <w:proofErr w:type="spellEnd"/>
+        <w:t xml:space="preserve"> to </w:t>
+      </w:r>
+      <w:r>
+        <w:rPr>
+          <w:rFonts w:ascii="Century Schoolbook" w:hAnsi="Century Schoolbook" w:hint="eastAsia"/>
+        </w:rPr>
+        <w:t xml:space="preserve">the one </w:t>
+      </w:r>
+      <w:r>
+        <w:rPr>
+          <w:rFonts w:ascii="Century Schoolbook" w:hAnsi="Century Schoolbook"/>
+        </w:rPr>
+        <w:t>“</w:t>
+      </w:r>
+      <w:r>
+        <w:rPr>
+          <w:rFonts w:ascii="Century Schoolbook" w:hAnsi="Century Schoolbook" w:hint="eastAsia"/>
+        </w:rPr>
+        <w:t>alt.athesim</w:t>
+      </w:r>
       <w:r>
         <w:rPr>
           <w:rFonts w:ascii="Century Schoolbook" w:hAnsi="Century Schoolbook"/>
@@ -2105,85 +1987,37 @@
         <w:rPr>
           <w:rFonts w:ascii="Century Schoolbook" w:hAnsi="Century Schoolbook" w:hint="eastAsia"/>
         </w:rPr>
-        <w:t xml:space="preserve"> to </w:t>
-      </w:r>
+        <w:t>.</w:t>
+      </w:r>
+    </w:p>
+    <w:p>
+      <w:pPr>
+        <w:jc w:val="both"/>
+        <w:rPr>
+          <w:rFonts w:ascii="Century Schoolbook" w:hAnsi="Century Schoolbook"/>
+        </w:rPr>
+      </w:pPr>
       <w:r>
         <w:rPr>
           <w:rFonts w:ascii="Century Schoolbook" w:hAnsi="Century Schoolbook" w:hint="eastAsia"/>
-        </w:rPr>
-        <w:t xml:space="preserve">the one </w:t>
-      </w:r>
-      <w:r>
-        <w:rPr>
-          <w:rFonts w:ascii="Century Schoolbook" w:hAnsi="Century Schoolbook"/>
-        </w:rPr>
-        <w:t>“</w:t>
-      </w:r>
-      <w:proofErr w:type="spellStart"/>
-      <w:proofErr w:type="gramStart"/>
+          <w:b/>
+          <w:bCs/>
+        </w:rPr>
+        <w:t>2.</w:t>
+      </w:r>
       <w:r>
         <w:rPr>
           <w:rFonts w:ascii="Century Schoolbook" w:hAnsi="Century Schoolbook" w:hint="eastAsia"/>
-        </w:rPr>
-        <w:t>alt.athesim</w:t>
-      </w:r>
-      <w:proofErr w:type="spellEnd"/>
-      <w:proofErr w:type="gramEnd"/>
-      <w:r>
-        <w:rPr>
-          <w:rFonts w:ascii="Century Schoolbook" w:hAnsi="Century Schoolbook"/>
-        </w:rPr>
-        <w:t>”</w:t>
+          <w:b/>
+          <w:bCs/>
+        </w:rPr>
+        <w:t xml:space="preserve"> </w:t>
       </w:r>
       <w:r>
         <w:rPr>
           <w:rFonts w:ascii="Century Schoolbook" w:hAnsi="Century Schoolbook" w:hint="eastAsia"/>
         </w:rPr>
-        <w:t>.</w:t>
-      </w:r>
-    </w:p>
-    <w:p>
-      <w:pPr>
-        <w:jc w:val="both"/>
-        <w:rPr>
-          <w:rFonts w:ascii="Century Schoolbook" w:hAnsi="Century Schoolbook"/>
-        </w:rPr>
-      </w:pPr>
-      <w:r>
-        <w:rPr>
-          <w:rFonts w:ascii="Century Schoolbook" w:hAnsi="Century Schoolbook" w:hint="eastAsia"/>
-          <w:b/>
-          <w:bCs/>
-        </w:rPr>
-        <w:t>2.</w:t>
-      </w:r>
-      <w:r>
-        <w:rPr>
-          <w:rFonts w:ascii="Century Schoolbook" w:hAnsi="Century Schoolbook" w:hint="eastAsia"/>
-          <w:b/>
-          <w:bCs/>
-        </w:rPr>
-        <w:t xml:space="preserve"> </w:t>
-      </w:r>
-      <w:r>
-        <w:rPr>
-          <w:rFonts w:ascii="Century Schoolbook" w:hAnsi="Century Schoolbook" w:hint="eastAsia"/>
-        </w:rPr>
-        <w:t xml:space="preserve">If the dataset distribution is imbalanced, the sampling might </w:t>
-      </w:r>
-      <w:proofErr w:type="spellStart"/>
-      <w:r>
-        <w:rPr>
-          <w:rFonts w:ascii="Century Schoolbook" w:hAnsi="Century Schoolbook" w:hint="eastAsia"/>
-        </w:rPr>
-        <w:t>includ</w:t>
-      </w:r>
-      <w:proofErr w:type="spellEnd"/>
-      <w:r>
-        <w:rPr>
-          <w:rFonts w:ascii="Century Schoolbook" w:hAnsi="Century Schoolbook" w:hint="eastAsia"/>
-        </w:rPr>
-        <w:t xml:space="preserve"> too much of some specific types of data, resulting in incorrect analysis output.</w:t>
+        <w:t>If the dataset distribution is imbalanced, the sampling might includ too much of some specific types of data, resulting in incorrect analysis output.</w:t>
       </w:r>
     </w:p>
     <w:p>
@@ -2325,7 +2159,6 @@
         </w:rPr>
         <w:t xml:space="preserve">In Section 5.3, the </w:t>
       </w:r>
-      <w:proofErr w:type="spellStart"/>
       <w:r>
         <w:rPr>
           <w:rFonts w:ascii="Century Schoolbook" w:hAnsi="Century Schoolbook"/>
@@ -2334,48 +2167,19 @@
         </w:rPr>
         <w:t>CountVectorizer</w:t>
       </w:r>
-      <w:proofErr w:type="spellEnd"/>
       <w:r>
         <w:rPr>
           <w:rFonts w:ascii="Century Schoolbook" w:hAnsi="Century Schoolbook"/>
         </w:rPr>
         <w:t xml:space="preserve"> converts text into a document-term matrix using </w:t>
       </w:r>
-      <w:proofErr w:type="spellStart"/>
-      <w:r>
-        <w:rPr>
-          <w:rFonts w:ascii="Century Schoolbook" w:hAnsi="Century Schoolbook"/>
-          <w:b/>
-          <w:bCs/>
-        </w:rPr>
-        <w:t>stop_words</w:t>
-      </w:r>
-      <w:proofErr w:type="spellEnd"/>
-      <w:r>
-        <w:rPr>
-          <w:rFonts w:ascii="Century Schoolbook" w:hAnsi="Century Schoolbook"/>
-          <w:b/>
-          <w:bCs/>
-        </w:rPr>
-        <w:t>='</w:t>
-      </w:r>
-      <w:proofErr w:type="spellStart"/>
-      <w:r>
-        <w:rPr>
-          <w:rFonts w:ascii="Century Schoolbook" w:hAnsi="Century Schoolbook"/>
-          <w:b/>
-          <w:bCs/>
-        </w:rPr>
-        <w:t>english</w:t>
-      </w:r>
-      <w:proofErr w:type="spellEnd"/>
-      <w:r>
-        <w:rPr>
-          <w:rFonts w:ascii="Century Schoolbook" w:hAnsi="Century Schoolbook"/>
-          <w:b/>
-          <w:bCs/>
-        </w:rPr>
-        <w:t>’</w:t>
+      <w:r>
+        <w:rPr>
+          <w:rFonts w:ascii="Century Schoolbook" w:hAnsi="Century Schoolbook"/>
+          <w:b/>
+          <w:bCs/>
+        </w:rPr>
+        <w:t>stop_words='english’</w:t>
       </w:r>
       <w:r>
         <w:rPr>
@@ -2383,23 +2187,13 @@
         </w:rPr>
         <w:t xml:space="preserve">. Change this parameter to </w:t>
       </w:r>
-      <w:proofErr w:type="spellStart"/>
-      <w:r>
-        <w:rPr>
-          <w:rFonts w:ascii="Century Schoolbook" w:hAnsi="Century Schoolbook"/>
-          <w:b/>
-          <w:bCs/>
-        </w:rPr>
-        <w:t>stop_words</w:t>
-      </w:r>
-      <w:proofErr w:type="spellEnd"/>
-      <w:r>
-        <w:rPr>
-          <w:rFonts w:ascii="Century Schoolbook" w:hAnsi="Century Schoolbook"/>
-          <w:b/>
-          <w:bCs/>
-        </w:rPr>
-        <w:t>=None</w:t>
+      <w:r>
+        <w:rPr>
+          <w:rFonts w:ascii="Century Schoolbook" w:hAnsi="Century Schoolbook"/>
+          <w:b/>
+          <w:bCs/>
+        </w:rPr>
+        <w:t>stop_words=None</w:t>
       </w:r>
       <w:r>
         <w:rPr>
@@ -2407,7 +2201,6 @@
         </w:rPr>
         <w:t xml:space="preserve"> and re-run the cell to check the shape of </w:t>
       </w:r>
-      <w:proofErr w:type="spellStart"/>
       <w:r>
         <w:rPr>
           <w:rFonts w:ascii="Century Schoolbook" w:hAnsi="Century Schoolbook"/>
@@ -2416,7 +2209,6 @@
         </w:rPr>
         <w:t>X_counts</w:t>
       </w:r>
-      <w:proofErr w:type="spellEnd"/>
       <w:r>
         <w:rPr>
           <w:rFonts w:ascii="Century Schoolbook" w:hAnsi="Century Schoolbook"/>
@@ -2495,21 +2287,7 @@
         <w:rPr>
           <w:rFonts w:ascii="Century Schoolbook" w:hAnsi="Century Schoolbook"/>
         </w:rPr>
-        <w:t xml:space="preserve">Since </w:t>
-      </w:r>
-      <w:proofErr w:type="spellStart"/>
-      <w:r>
-        <w:rPr>
-          <w:rFonts w:ascii="Century Schoolbook" w:hAnsi="Century Schoolbook"/>
-        </w:rPr>
-        <w:t>stopwords</w:t>
-      </w:r>
-      <w:proofErr w:type="spellEnd"/>
-      <w:r>
-        <w:rPr>
-          <w:rFonts w:ascii="Century Schoolbook" w:hAnsi="Century Schoolbook"/>
-        </w:rPr>
-        <w:t xml:space="preserve"> are highly common words that appear in almost all documents, what effect does adding them back have on the overall sparsity (the percentage of zeros) of the matrix?</w:t>
+        <w:t>Since stopwords are highly common words that appear in almost all documents, what effect does adding them back have on the overall sparsity (the percentage of zeros) of the matrix?</w:t>
       </w:r>
     </w:p>
     <w:p>
@@ -2558,35 +2336,13 @@
         <w:rPr>
           <w:rFonts w:ascii="Century Schoolbook" w:hAnsi="Century Schoolbook" w:hint="eastAsia"/>
         </w:rPr>
-        <w:t xml:space="preserve">The original number of features was 35482, and after using </w:t>
-      </w:r>
-      <w:proofErr w:type="spellStart"/>
+        <w:t>Yes, t</w:t>
+      </w:r>
       <w:r>
         <w:rPr>
           <w:rFonts w:ascii="Century Schoolbook" w:hAnsi="Century Schoolbook" w:hint="eastAsia"/>
         </w:rPr>
-        <w:t>stop_word</w:t>
-      </w:r>
-      <w:proofErr w:type="spellEnd"/>
-      <w:r>
-        <w:rPr>
-          <w:rFonts w:ascii="Century Schoolbook" w:hAnsi="Century Schoolbook" w:hint="eastAsia"/>
-        </w:rPr>
-        <w:t xml:space="preserve">=None, the </w:t>
-      </w:r>
-      <w:proofErr w:type="gramStart"/>
-      <w:r>
-        <w:rPr>
-          <w:rFonts w:ascii="Century Schoolbook" w:hAnsi="Century Schoolbook" w:hint="eastAsia"/>
-        </w:rPr>
-        <w:t>number  increased</w:t>
-      </w:r>
-      <w:proofErr w:type="gramEnd"/>
-      <w:r>
-        <w:rPr>
-          <w:rFonts w:ascii="Century Schoolbook" w:hAnsi="Century Schoolbook" w:hint="eastAsia"/>
-        </w:rPr>
-        <w:t xml:space="preserve"> to 35788.</w:t>
+        <w:t>he original number of features was 35482, and after using stop_word=None, the number  increased to 35788.</w:t>
       </w:r>
     </w:p>
     <w:p>
@@ -2629,49 +2385,7 @@
         <w:rPr>
           <w:rFonts w:ascii="Century Schoolbook" w:hAnsi="Century Schoolbook" w:hint="eastAsia"/>
         </w:rPr>
-        <w:t xml:space="preserve">, pronouns, </w:t>
-      </w:r>
-      <w:proofErr w:type="spellStart"/>
-      <w:r>
-        <w:rPr>
-          <w:rFonts w:ascii="Century Schoolbook" w:hAnsi="Century Schoolbook" w:hint="eastAsia"/>
-        </w:rPr>
-        <w:t>etc</w:t>
-      </w:r>
-      <w:proofErr w:type="spellEnd"/>
-      <w:r>
-        <w:rPr>
-          <w:rFonts w:ascii="Century Schoolbook" w:hAnsi="Century Schoolbook" w:hint="eastAsia"/>
-        </w:rPr>
-        <w:t>) will end up taking the top-</w:t>
-      </w:r>
-      <w:proofErr w:type="gramStart"/>
-      <w:r>
-        <w:rPr>
-          <w:rFonts w:ascii="Century Schoolbook" w:hAnsi="Century Schoolbook" w:hint="eastAsia"/>
-        </w:rPr>
-        <w:t>n common words</w:t>
-      </w:r>
-      <w:proofErr w:type="gramEnd"/>
-      <w:r>
-        <w:rPr>
-          <w:rFonts w:ascii="Century Schoolbook" w:hAnsi="Century Schoolbook" w:hint="eastAsia"/>
-        </w:rPr>
-        <w:t xml:space="preserve"> after adding them back. This causes the matrix </w:t>
-      </w:r>
-      <w:proofErr w:type="gramStart"/>
-      <w:r>
-        <w:rPr>
-          <w:rFonts w:ascii="Century Schoolbook" w:hAnsi="Century Schoolbook" w:hint="eastAsia"/>
-        </w:rPr>
-        <w:t>show</w:t>
-      </w:r>
-      <w:proofErr w:type="gramEnd"/>
-      <w:r>
-        <w:rPr>
-          <w:rFonts w:ascii="Century Schoolbook" w:hAnsi="Century Schoolbook" w:hint="eastAsia"/>
-        </w:rPr>
-        <w:t xml:space="preserve"> less significant information.</w:t>
+        <w:t>, pronouns, etc) will end up taking the top-n common words after adding them back. This causes the matrix show less significant information.</w:t>
       </w:r>
     </w:p>
     <w:p>
@@ -2817,23 +2531,13 @@
         </w:rPr>
         <w:t xml:space="preserve">In the variance filtering section, re-run </w:t>
       </w:r>
-      <w:proofErr w:type="spellStart"/>
-      <w:r>
-        <w:rPr>
-          <w:rFonts w:ascii="Century Schoolbook" w:hAnsi="Century Schoolbook"/>
-          <w:b/>
-          <w:bCs/>
-        </w:rPr>
-        <w:t>variance_filter</w:t>
-      </w:r>
-      <w:proofErr w:type="spellEnd"/>
-      <w:r>
-        <w:rPr>
-          <w:rFonts w:ascii="Century Schoolbook" w:hAnsi="Century Schoolbook"/>
-          <w:b/>
-          <w:bCs/>
-        </w:rPr>
-        <w:t xml:space="preserve"> </w:t>
+      <w:r>
+        <w:rPr>
+          <w:rFonts w:ascii="Century Schoolbook" w:hAnsi="Century Schoolbook"/>
+          <w:b/>
+          <w:bCs/>
+        </w:rPr>
+        <w:t xml:space="preserve">variance_filter </w:t>
       </w:r>
       <w:r>
         <w:rPr>
@@ -3008,78 +2712,44 @@
         <w:rPr>
           <w:rFonts w:ascii="Century Schoolbook" w:hAnsi="Century Schoolbook" w:hint="eastAsia"/>
         </w:rPr>
-        <w:t xml:space="preserve">The removed words include </w:t>
-      </w:r>
-      <w:proofErr w:type="spellStart"/>
+        <w:t>The removed words include z</w:t>
+      </w:r>
+      <w:r>
+        <w:rPr>
+          <w:rFonts w:ascii="Century Schoolbook" w:hAnsi="Century Schoolbook"/>
+        </w:rPr>
+        <w:t>umder</w:t>
+      </w:r>
       <w:r>
         <w:rPr>
           <w:rFonts w:ascii="Century Schoolbook" w:hAnsi="Century Schoolbook" w:hint="eastAsia"/>
         </w:rPr>
-        <w:t>z</w:t>
-      </w:r>
-      <w:r>
-        <w:rPr>
-          <w:rFonts w:ascii="Century Schoolbook" w:hAnsi="Century Schoolbook"/>
-        </w:rPr>
-        <w:t>umder</w:t>
-      </w:r>
-      <w:proofErr w:type="spellEnd"/>
+        <w:t xml:space="preserve">, </w:t>
+      </w:r>
+      <w:r>
+        <w:rPr>
+          <w:rFonts w:ascii="Century Schoolbook" w:hAnsi="Century Schoolbook"/>
+        </w:rPr>
+        <w:t>zur</w:t>
+      </w:r>
       <w:r>
         <w:rPr>
           <w:rFonts w:ascii="Century Schoolbook" w:hAnsi="Century Schoolbook" w:hint="eastAsia"/>
         </w:rPr>
         <w:t xml:space="preserve">, </w:t>
       </w:r>
-      <w:proofErr w:type="spellStart"/>
-      <w:r>
-        <w:rPr>
-          <w:rFonts w:ascii="Century Schoolbook" w:hAnsi="Century Schoolbook"/>
-        </w:rPr>
-        <w:t>zur</w:t>
-      </w:r>
-      <w:proofErr w:type="spellEnd"/>
+      <w:r>
+        <w:rPr>
+          <w:rFonts w:ascii="Century Schoolbook" w:hAnsi="Century Schoolbook"/>
+        </w:rPr>
+        <w:t>kuala</w:t>
+      </w:r>
       <w:r>
         <w:rPr>
           <w:rFonts w:ascii="Century Schoolbook" w:hAnsi="Century Schoolbook" w:hint="eastAsia"/>
         </w:rPr>
-        <w:t xml:space="preserve">, </w:t>
-      </w:r>
-      <w:proofErr w:type="spellStart"/>
-      <w:r>
-        <w:rPr>
-          <w:rFonts w:ascii="Century Schoolbook" w:hAnsi="Century Schoolbook"/>
-        </w:rPr>
-        <w:t>kuala</w:t>
-      </w:r>
-      <w:proofErr w:type="spellEnd"/>
-      <w:r>
-        <w:rPr>
-          <w:rFonts w:ascii="Century Schoolbook" w:hAnsi="Century Schoolbook" w:hint="eastAsia"/>
-        </w:rPr>
-        <w:t xml:space="preserve">, </w:t>
-      </w:r>
-      <w:proofErr w:type="spellStart"/>
-      <w:r>
-        <w:rPr>
-          <w:rFonts w:ascii="Century Schoolbook" w:hAnsi="Century Schoolbook" w:hint="eastAsia"/>
-        </w:rPr>
-        <w:t>zus</w:t>
-      </w:r>
-      <w:proofErr w:type="spellEnd"/>
-      <w:r>
-        <w:rPr>
-          <w:rFonts w:ascii="Century Schoolbook" w:hAnsi="Century Schoolbook" w:hint="eastAsia"/>
-        </w:rPr>
-        <w:t xml:space="preserve">, </w:t>
-      </w:r>
-      <w:proofErr w:type="spellStart"/>
-      <w:r>
-        <w:rPr>
-          <w:rFonts w:ascii="Century Schoolbook" w:hAnsi="Century Schoolbook" w:hint="eastAsia"/>
-        </w:rPr>
-        <w:t>zvi</w:t>
-      </w:r>
-      <w:proofErr w:type="spellEnd"/>
+        <w:t>, zus, zvi</w:t>
+      </w:r>
       <w:r>
         <w:rPr>
           <w:rFonts w:ascii="Century Schoolbook" w:hAnsi="Century Schoolbook" w:hint="eastAsia"/>
@@ -3546,8 +3216,6 @@
         </w:rPr>
         <w:t xml:space="preserve">Run the correlation filter against the binary indicator for the </w:t>
       </w:r>
-      <w:proofErr w:type="spellStart"/>
-      <w:proofErr w:type="gramStart"/>
       <w:r>
         <w:rPr>
           <w:rFonts w:ascii="Century Schoolbook" w:hAnsi="Century Schoolbook"/>
@@ -3556,15 +3224,12 @@
         </w:rPr>
         <w:t>comp.graphics</w:t>
       </w:r>
-      <w:proofErr w:type="spellEnd"/>
-      <w:proofErr w:type="gramEnd"/>
       <w:r>
         <w:rPr>
           <w:rFonts w:ascii="Century Schoolbook" w:hAnsi="Century Schoolbook"/>
         </w:rPr>
         <w:t xml:space="preserve"> class. Inspect the top 10 features sorted by </w:t>
       </w:r>
-      <w:proofErr w:type="spellStart"/>
       <w:r>
         <w:rPr>
           <w:rFonts w:ascii="Century Schoolbook" w:hAnsi="Century Schoolbook"/>
@@ -3573,14 +3238,12 @@
         </w:rPr>
         <w:t>pearson_r</w:t>
       </w:r>
-      <w:proofErr w:type="spellEnd"/>
       <w:r>
         <w:rPr>
           <w:rFonts w:ascii="Century Schoolbook" w:hAnsi="Century Schoolbook"/>
         </w:rPr>
         <w:t xml:space="preserve"> and compare them to the top 10 features sorted by </w:t>
       </w:r>
-      <w:proofErr w:type="spellStart"/>
       <w:r>
         <w:rPr>
           <w:rFonts w:ascii="Century Schoolbook" w:hAnsi="Century Schoolbook"/>
@@ -3589,7 +3252,6 @@
         </w:rPr>
         <w:t>spearman_r</w:t>
       </w:r>
-      <w:proofErr w:type="spellEnd"/>
       <w:r>
         <w:rPr>
           <w:rFonts w:ascii="Century Schoolbook" w:hAnsi="Century Schoolbook"/>
@@ -3768,262 +3430,196 @@
         </w:numPr>
         <w:jc w:val="both"/>
         <w:rPr>
+          <w:rFonts w:ascii="Century Schoolbook" w:hAnsi="Century Schoolbook"/>
+        </w:rPr>
+      </w:pPr>
+      <w:r>
+        <w:rPr>
           <w:rFonts w:ascii="Century Schoolbook" w:hAnsi="Century Schoolbook" w:hint="eastAsia"/>
         </w:rPr>
-      </w:pPr>
+        <w:t>In Pearson, the top-correlated words include common non-stop words (thanks, hi, looking, people</w:t>
+      </w:r>
+      <w:r>
+        <w:rPr>
+          <w:rFonts w:ascii="Century Schoolbook" w:hAnsi="Century Schoolbook"/>
+        </w:rPr>
+        <w:t>…</w:t>
+      </w:r>
       <w:r>
         <w:rPr>
           <w:rFonts w:ascii="Century Schoolbook" w:hAnsi="Century Schoolbook" w:hint="eastAsia"/>
         </w:rPr>
-        <w:t>In Pearson, the top-correlated words include common non-stop words (thanks, hi, looking, people</w:t>
-      </w:r>
-      <w:r>
-        <w:rPr>
-          <w:rFonts w:ascii="Century Schoolbook" w:hAnsi="Century Schoolbook"/>
-        </w:rPr>
-        <w:t>…</w:t>
+        <w:t>) while those in Spearman</w:t>
       </w:r>
       <w:r>
         <w:rPr>
           <w:rFonts w:ascii="Century Schoolbook" w:hAnsi="Century Schoolbook" w:hint="eastAsia"/>
         </w:rPr>
-        <w:t>) while those in Spearman</w:t>
+        <w:t xml:space="preserve"> starts from</w:t>
+      </w:r>
+      <w:r>
+        <w:t xml:space="preserve"> </w:t>
+      </w:r>
+      <w:r>
+        <w:rPr>
+          <w:rFonts w:ascii="Century Schoolbook" w:hAnsi="Century Schoolbook"/>
+        </w:rPr>
+        <w:t>graphics</w:t>
       </w:r>
       <w:r>
         <w:rPr>
           <w:rFonts w:ascii="Century Schoolbook" w:hAnsi="Century Schoolbook" w:hint="eastAsia"/>
         </w:rPr>
-        <w:t xml:space="preserve"> starts from</w:t>
-      </w:r>
-      <w:r>
+        <w:t>, people, files, image</w:t>
+      </w:r>
+      <w:r>
+        <w:rPr>
+          <w:rFonts w:ascii="Century Schoolbook" w:hAnsi="Century Schoolbook" w:hint="eastAsia"/>
+        </w:rPr>
+        <w:t>, god, 3d, etc. From the results, it can be found that the proportion of domain-specific term increases.</w:t>
+      </w:r>
+      <w:r>
+        <w:rPr>
+          <w:rFonts w:ascii="Century Schoolbook" w:hAnsi="Century Schoolbook" w:hint="eastAsia"/>
+        </w:rPr>
         <w:t xml:space="preserve"> </w:t>
       </w:r>
-      <w:r>
-        <w:rPr>
-          <w:rFonts w:ascii="Century Schoolbook" w:hAnsi="Century Schoolbook"/>
-        </w:rPr>
-        <w:t>graphics</w:t>
-      </w:r>
+    </w:p>
+    <w:p>
+      <w:pPr>
+        <w:jc w:val="both"/>
+        <w:rPr>
+          <w:rFonts w:ascii="Century Schoolbook" w:hAnsi="Century Schoolbook"/>
+        </w:rPr>
+      </w:pPr>
       <w:r>
         <w:rPr>
           <w:rFonts w:ascii="Century Schoolbook" w:hAnsi="Century Schoolbook" w:hint="eastAsia"/>
         </w:rPr>
-        <w:t>, people, files, image</w:t>
+        <w:t>2.</w:t>
       </w:r>
       <w:r>
         <w:rPr>
           <w:rFonts w:ascii="Century Schoolbook" w:hAnsi="Century Schoolbook" w:hint="eastAsia"/>
         </w:rPr>
-        <w:t xml:space="preserve">, </w:t>
-      </w:r>
-      <w:proofErr w:type="gramStart"/>
+        <w:t xml:space="preserve"> </w:t>
+      </w:r>
       <w:r>
         <w:rPr>
           <w:rFonts w:ascii="Century Schoolbook" w:hAnsi="Century Schoolbook" w:hint="eastAsia"/>
         </w:rPr>
-        <w:t>god</w:t>
-      </w:r>
-      <w:proofErr w:type="gramEnd"/>
+        <w:t xml:space="preserve">Pearson uses raw values and calculate linear relation, whereas Spearman changes the values into ranking and compares the numbers without considering the difference </w:t>
+      </w:r>
+      <w:r>
+        <w:rPr>
+          <w:rFonts w:ascii="Century Schoolbook" w:hAnsi="Century Schoolbook"/>
+        </w:rPr>
+        <w:t>magnitude</w:t>
+      </w:r>
       <w:r>
         <w:rPr>
           <w:rFonts w:ascii="Century Schoolbook" w:hAnsi="Century Schoolbook" w:hint="eastAsia"/>
         </w:rPr>
-        <w:t>, 3d, etc. From the results, it can be found that the proportion of domain-specific term increases.</w:t>
-      </w:r>
-      <w:r>
+        <w:t>.</w:t>
+      </w:r>
+    </w:p>
+    <w:p>
+      <w:pPr>
+        <w:jc w:val="both"/>
         <w:rPr>
           <w:rFonts w:ascii="Century Schoolbook" w:hAnsi="Century Schoolbook" w:hint="eastAsia"/>
         </w:rPr>
+      </w:pPr>
+      <w:r>
+        <w:rPr>
+          <w:rFonts w:ascii="Century Schoolbook" w:hAnsi="Century Schoolbook" w:hint="eastAsia"/>
+        </w:rPr>
+        <w:t>3.</w:t>
+      </w:r>
+      <w:r>
+        <w:rPr>
+          <w:rFonts w:ascii="Century Schoolbook" w:hAnsi="Century Schoolbook" w:hint="eastAsia"/>
+        </w:rPr>
         <w:t xml:space="preserve"> </w:t>
       </w:r>
-    </w:p>
-    <w:p>
-      <w:pPr>
-        <w:jc w:val="both"/>
+      <w:r>
         <w:rPr>
           <w:rFonts w:ascii="Century Schoolbook" w:hAnsi="Century Schoolbook" w:hint="eastAsia"/>
         </w:rPr>
-      </w:pPr>
+        <w:t xml:space="preserve">When a term </w:t>
+      </w:r>
+      <w:r>
+        <w:rPr>
+          <w:rFonts w:ascii="Century Schoolbook" w:hAnsi="Century Schoolbook"/>
+        </w:rPr>
+        <w:t>appears steadily in most posts of the topic</w:t>
+      </w:r>
       <w:r>
         <w:rPr>
           <w:rFonts w:ascii="Century Schoolbook" w:hAnsi="Century Schoolbook" w:hint="eastAsia"/>
         </w:rPr>
-        <w:t>2.</w:t>
+        <w:t xml:space="preserve"> but </w:t>
+      </w:r>
+      <w:r>
+        <w:rPr>
+          <w:rFonts w:ascii="Century Schoolbook" w:hAnsi="Century Schoolbook"/>
+        </w:rPr>
+        <w:t>occurs very frequently in a few long outlier posts</w:t>
       </w:r>
       <w:r>
         <w:rPr>
           <w:rFonts w:ascii="Century Schoolbook" w:hAnsi="Century Schoolbook" w:hint="eastAsia"/>
         </w:rPr>
-        <w:t xml:space="preserve"> </w:t>
+        <w:t xml:space="preserve">, Pearson value will get lowered </w:t>
+      </w:r>
+      <w:r>
+        <w:rPr>
+          <w:rFonts w:ascii="Century Schoolbook" w:hAnsi="Century Schoolbook"/>
+        </w:rPr>
+        <w:t>by these extreme counts</w:t>
       </w:r>
       <w:r>
         <w:rPr>
           <w:rFonts w:ascii="Century Schoolbook" w:hAnsi="Century Schoolbook" w:hint="eastAsia"/>
         </w:rPr>
-        <w:t xml:space="preserve">Pearson uses raw values and </w:t>
-      </w:r>
-      <w:proofErr w:type="gramStart"/>
+        <w:t xml:space="preserve">, but Spearman only </w:t>
+      </w:r>
+      <w:r>
+        <w:rPr>
+          <w:rFonts w:ascii="Century Schoolbook" w:hAnsi="Century Schoolbook"/>
+        </w:rPr>
+        <w:t>consider</w:t>
+      </w:r>
       <w:r>
         <w:rPr>
           <w:rFonts w:ascii="Century Schoolbook" w:hAnsi="Century Schoolbook" w:hint="eastAsia"/>
         </w:rPr>
-        <w:t>calculate</w:t>
-      </w:r>
-      <w:proofErr w:type="gramEnd"/>
-      <w:r>
+        <w:t xml:space="preserve"> ranking, which remains unchanged. </w:t>
+      </w:r>
+      <w:r>
+        <w:rPr>
+          <w:rFonts w:ascii="Century Schoolbook" w:hAnsi="Century Schoolbook"/>
+        </w:rPr>
+        <w:t>For example, “graphics” has a Spearman correlation of 0.521 with comp.graphics, but its Pearson correlation is only 0.178. Most comp.graphics posts that contain “graphics” use it only 1 to 4 times, but one post uses it 105 times.</w:t>
+      </w:r>
+    </w:p>
+    <w:p>
+      <w:pPr>
+        <w:jc w:val="both"/>
         <w:rPr>
           <w:rFonts w:ascii="Century Schoolbook" w:hAnsi="Century Schoolbook" w:hint="eastAsia"/>
         </w:rPr>
-        <w:t xml:space="preserve"> linear relation, whereas Spearman changes the values into ranking and compares the numbers without considering the difference </w:t>
-      </w:r>
-      <w:r>
-        <w:rPr>
-          <w:rFonts w:ascii="Century Schoolbook" w:hAnsi="Century Schoolbook"/>
-        </w:rPr>
-        <w:t>magnitude</w:t>
-      </w:r>
-      <w:r>
-        <w:rPr>
-          <w:rFonts w:ascii="Century Schoolbook" w:hAnsi="Century Schoolbook" w:hint="eastAsia"/>
-        </w:rPr>
-        <w:t>.</w:t>
-      </w:r>
-    </w:p>
-    <w:p>
-      <w:pPr>
-        <w:jc w:val="both"/>
-        <w:rPr>
-          <w:rFonts w:ascii="Century Schoolbook" w:hAnsi="Century Schoolbook" w:hint="eastAsia"/>
-        </w:rPr>
-      </w:pPr>
-      <w:r>
-        <w:rPr>
-          <w:rFonts w:ascii="Century Schoolbook" w:hAnsi="Century Schoolbook" w:hint="eastAsia"/>
-          <w:highlight w:val="yellow"/>
-        </w:rPr>
-        <w:t>3.</w:t>
-      </w:r>
-      <w:r>
-        <w:rPr>
-          <w:rFonts w:ascii="Century Schoolbook" w:hAnsi="Century Schoolbook" w:hint="eastAsia"/>
-          <w:highlight w:val="yellow"/>
-        </w:rPr>
-        <w:t xml:space="preserve"> </w:t>
-      </w:r>
-      <w:r>
-        <w:rPr>
-          <w:rFonts w:ascii="Century Schoolbook" w:hAnsi="Century Schoolbook" w:hint="eastAsia"/>
-          <w:highlight w:val="yellow"/>
-        </w:rPr>
-        <w:t xml:space="preserve">In the scenario that a word </w:t>
-      </w:r>
-      <w:r>
-        <w:rPr>
-          <w:rFonts w:ascii="Century Schoolbook" w:hAnsi="Century Schoolbook"/>
-          <w:highlight w:val="yellow"/>
-        </w:rPr>
-        <w:t>has</w:t>
-      </w:r>
-      <w:r>
-        <w:rPr>
-          <w:rFonts w:ascii="Century Schoolbook" w:hAnsi="Century Schoolbook" w:hint="eastAsia"/>
-          <w:highlight w:val="yellow"/>
-        </w:rPr>
-        <w:t xml:space="preserve"> specifically high </w:t>
-      </w:r>
-      <w:r>
-        <w:rPr>
-          <w:rFonts w:ascii="Century Schoolbook" w:hAnsi="Century Schoolbook"/>
-          <w:highlight w:val="yellow"/>
-        </w:rPr>
-        <w:t>correlation</w:t>
-      </w:r>
-      <w:r>
-        <w:rPr>
-          <w:rFonts w:ascii="Century Schoolbook" w:hAnsi="Century Schoolbook" w:hint="eastAsia"/>
-          <w:highlight w:val="yellow"/>
-        </w:rPr>
-        <w:t xml:space="preserve"> with a topic while </w:t>
-      </w:r>
-      <w:r>
-        <w:rPr>
-          <w:rFonts w:ascii="Century Schoolbook" w:hAnsi="Century Schoolbook"/>
-          <w:highlight w:val="yellow"/>
-        </w:rPr>
-        <w:t>doesn’t</w:t>
-      </w:r>
-      <w:r>
-        <w:rPr>
-          <w:rFonts w:ascii="Century Schoolbook" w:hAnsi="Century Schoolbook" w:hint="eastAsia"/>
-          <w:highlight w:val="yellow"/>
-        </w:rPr>
-        <w:t xml:space="preserve"> share the same relation with others. It will increase Spearman correlation but decrease Pearson. </w:t>
-      </w:r>
-      <w:r>
-        <w:rPr>
-          <w:rFonts w:ascii="Century Schoolbook" w:hAnsi="Century Schoolbook" w:hint="eastAsia"/>
-          <w:highlight w:val="yellow"/>
-        </w:rPr>
-        <w:t xml:space="preserve">From the screenshot below, we can see </w:t>
-      </w:r>
-      <w:r>
-        <w:rPr>
-          <w:rFonts w:ascii="Century Schoolbook" w:hAnsi="Century Schoolbook"/>
-          <w:highlight w:val="yellow"/>
-        </w:rPr>
-        <w:t>“</w:t>
-      </w:r>
-      <w:r>
-        <w:rPr>
-          <w:rFonts w:ascii="Century Schoolbook" w:hAnsi="Century Schoolbook" w:hint="eastAsia"/>
-          <w:highlight w:val="yellow"/>
-        </w:rPr>
-        <w:t>graphics</w:t>
-      </w:r>
-      <w:r>
-        <w:rPr>
-          <w:rFonts w:ascii="Century Schoolbook" w:hAnsi="Century Schoolbook"/>
-          <w:highlight w:val="yellow"/>
-        </w:rPr>
-        <w:t>”</w:t>
-      </w:r>
-      <w:r>
-        <w:rPr>
-          <w:rFonts w:ascii="Century Schoolbook" w:hAnsi="Century Schoolbook" w:hint="eastAsia"/>
-          <w:highlight w:val="yellow"/>
-        </w:rPr>
-        <w:t xml:space="preserve"> appears 105 times in a single article</w:t>
-      </w:r>
-      <w:r>
-        <w:rPr>
-          <w:rFonts w:ascii="Century Schoolbook" w:hAnsi="Century Schoolbook" w:hint="eastAsia"/>
-          <w:highlight w:val="yellow"/>
-        </w:rPr>
-        <w:t>, but most of other articles contains less than 32 times, so from this we can infer that</w:t>
-      </w:r>
-      <w:r>
-        <w:rPr>
-          <w:rFonts w:ascii="Century Schoolbook" w:hAnsi="Century Schoolbook" w:hint="eastAsia"/>
-        </w:rPr>
-        <w:t xml:space="preserve"> </w:t>
-      </w:r>
-    </w:p>
-    <w:p>
-      <w:pPr>
-        <w:jc w:val="both"/>
-        <w:rPr>
-          <w:rFonts w:ascii="Century Schoolbook" w:hAnsi="Century Schoolbook" w:hint="eastAsia"/>
-        </w:rPr>
-      </w:pPr>
-      <w:r>
-        <w:rPr>
-          <w:rFonts w:ascii="Century Schoolbook" w:hAnsi="Century Schoolbook"/>
-        </w:rPr>
+      </w:pPr>
+      <w:r>
+        <w:rPr>
+          <w:rFonts w:ascii="Century Schoolbook" w:hAnsi="Century Schoolbook"/>
+        </w:rPr>
+        <w:lastRenderedPageBreak/>
         <w:drawing>
-          <wp:inline distT="0" distB="0" distL="0" distR="0" wp14:anchorId="52DCFA8E" wp14:editId="757B74DF">
-            <wp:extent cx="2888343" cy="1457612"/>
-            <wp:effectExtent l="0" t="0" r="7620" b="9525"/>
-            <wp:docPr id="315925833" name="圖片 1"/>
+          <wp:inline distT="0" distB="0" distL="0" distR="0" wp14:anchorId="1B861CA5" wp14:editId="200D7232">
+            <wp:extent cx="3784600" cy="2270760"/>
+            <wp:effectExtent l="0" t="0" r="6350" b="0"/>
+            <wp:docPr id="1161575233" name="圖片 1"/>
             <wp:cNvGraphicFramePr>
               <a:graphicFrameLocks xmlns:a="http://schemas.openxmlformats.org/drawingml/2006/main" noChangeAspect="1"/>
             </wp:cNvGraphicFramePr>
@@ -4031,7 +3627,7 @@
               <a:graphicData uri="http://schemas.openxmlformats.org/drawingml/2006/picture">
                 <pic:pic xmlns:pic="http://schemas.openxmlformats.org/drawingml/2006/picture">
                   <pic:nvPicPr>
-                    <pic:cNvPr id="315925833" name=""/>
+                    <pic:cNvPr id="1161575233" name=""/>
                     <pic:cNvPicPr/>
                   </pic:nvPicPr>
                   <pic:blipFill>
@@ -4043,7 +3639,7 @@
                   <pic:spPr>
                     <a:xfrm>
                       <a:off x="0" y="0"/>
-                      <a:ext cx="2897032" cy="1461997"/>
+                      <a:ext cx="3784801" cy="2270881"/>
                     </a:xfrm>
                     <a:prstGeom prst="rect">
                       <a:avLst/>
@@ -4069,7 +3665,6 @@
           <w:b/>
           <w:bCs/>
         </w:rPr>
-        <w:lastRenderedPageBreak/>
         <w:t>AI used for this answer:</w:t>
       </w:r>
       <w:r>
@@ -4083,7 +3678,7 @@
       <w:pPr>
         <w:jc w:val="both"/>
         <w:rPr>
-          <w:rFonts w:ascii="Century Schoolbook" w:hAnsi="Century Schoolbook" w:hint="eastAsia"/>
+          <w:rFonts w:ascii="Century Schoolbook" w:hAnsi="Century Schoolbook"/>
         </w:rPr>
       </w:pPr>
       <w:r>
@@ -4250,23 +3845,13 @@
         </w:rPr>
         <w:t xml:space="preserve">In the Frequent Pattern Mining section, run </w:t>
       </w:r>
-      <w:proofErr w:type="gramStart"/>
-      <w:r>
-        <w:rPr>
-          <w:rFonts w:ascii="Century Schoolbook" w:hAnsi="Century Schoolbook"/>
-          <w:b/>
-          <w:bCs/>
-        </w:rPr>
-        <w:t>Top-K</w:t>
-      </w:r>
-      <w:proofErr w:type="gramEnd"/>
-      <w:r>
-        <w:rPr>
-          <w:rFonts w:ascii="Century Schoolbook" w:hAnsi="Century Schoolbook"/>
-          <w:b/>
-          <w:bCs/>
-        </w:rPr>
-        <w:t xml:space="preserve"> FAE</w:t>
+      <w:r>
+        <w:rPr>
+          <w:rFonts w:ascii="Century Schoolbook" w:hAnsi="Century Schoolbook"/>
+          <w:b/>
+          <w:bCs/>
+        </w:rPr>
+        <w:t>Top-K FAE</w:t>
       </w:r>
       <w:r>
         <w:rPr>
@@ -4288,7 +3873,6 @@
         </w:rPr>
         <w:t xml:space="preserve">. Then, run </w:t>
       </w:r>
-      <w:proofErr w:type="spellStart"/>
       <w:r>
         <w:rPr>
           <w:rFonts w:ascii="Century Schoolbook" w:hAnsi="Century Schoolbook"/>
@@ -4297,48 +3881,19 @@
         </w:rPr>
         <w:t>MaxFPGrowth</w:t>
       </w:r>
-      <w:proofErr w:type="spellEnd"/>
       <w:r>
         <w:rPr>
           <w:rFonts w:ascii="Century Schoolbook" w:hAnsi="Century Schoolbook"/>
         </w:rPr>
         <w:t xml:space="preserve"> using minimum support thresholds </w:t>
       </w:r>
-      <w:proofErr w:type="spellStart"/>
-      <w:r>
-        <w:rPr>
-          <w:rFonts w:ascii="Century Schoolbook" w:hAnsi="Century Schoolbook"/>
-          <w:b/>
-          <w:bCs/>
-        </w:rPr>
-        <w:t>minSup</w:t>
-      </w:r>
-      <w:proofErr w:type="spellEnd"/>
-      <w:r>
-        <w:rPr>
-          <w:rFonts w:ascii="Century Schoolbook" w:hAnsi="Century Schoolbook"/>
-          <w:b/>
-          <w:bCs/>
-        </w:rPr>
-        <w:t xml:space="preserve">=9 and </w:t>
-      </w:r>
-      <w:proofErr w:type="spellStart"/>
-      <w:r>
-        <w:rPr>
-          <w:rFonts w:ascii="Century Schoolbook" w:hAnsi="Century Schoolbook"/>
-          <w:b/>
-          <w:bCs/>
-        </w:rPr>
-        <w:t>minSup</w:t>
-      </w:r>
-      <w:proofErr w:type="spellEnd"/>
-      <w:r>
-        <w:rPr>
-          <w:rFonts w:ascii="Century Schoolbook" w:hAnsi="Century Schoolbook"/>
-          <w:b/>
-          <w:bCs/>
-        </w:rPr>
-        <w:t>= 3</w:t>
+      <w:r>
+        <w:rPr>
+          <w:rFonts w:ascii="Century Schoolbook" w:hAnsi="Century Schoolbook"/>
+          <w:b/>
+          <w:bCs/>
+        </w:rPr>
+        <w:t>minSup=9 and minSup= 3</w:t>
       </w:r>
       <w:r>
         <w:rPr>
@@ -4383,7 +3938,6 @@
         </w:rPr>
         <w:t xml:space="preserve">How does decreasing </w:t>
       </w:r>
-      <w:proofErr w:type="spellStart"/>
       <w:r>
         <w:rPr>
           <w:rFonts w:ascii="Century Schoolbook" w:hAnsi="Century Schoolbook"/>
@@ -4392,14 +3946,12 @@
         </w:rPr>
         <w:t>minSup</w:t>
       </w:r>
-      <w:proofErr w:type="spellEnd"/>
       <w:r>
         <w:rPr>
           <w:rFonts w:ascii="Century Schoolbook" w:hAnsi="Century Schoolbook"/>
         </w:rPr>
         <w:t xml:space="preserve"> (from 9 to 3) in </w:t>
       </w:r>
-      <w:proofErr w:type="spellStart"/>
       <w:r>
         <w:rPr>
           <w:rFonts w:ascii="Century Schoolbook" w:hAnsi="Century Schoolbook"/>
@@ -4408,7 +3960,6 @@
         </w:rPr>
         <w:t>MaxFPGrowth</w:t>
       </w:r>
-      <w:proofErr w:type="spellEnd"/>
       <w:r>
         <w:rPr>
           <w:rFonts w:ascii="Century Schoolbook" w:hAnsi="Century Schoolbook"/>
@@ -4434,23 +3985,13 @@
         </w:rPr>
         <w:t xml:space="preserve">How does the parameter k in </w:t>
       </w:r>
-      <w:proofErr w:type="gramStart"/>
-      <w:r>
-        <w:rPr>
-          <w:rFonts w:ascii="Century Schoolbook" w:hAnsi="Century Schoolbook"/>
-          <w:b/>
-          <w:bCs/>
-        </w:rPr>
-        <w:t>Top-K</w:t>
-      </w:r>
-      <w:proofErr w:type="gramEnd"/>
-      <w:r>
-        <w:rPr>
-          <w:rFonts w:ascii="Century Schoolbook" w:hAnsi="Century Schoolbook"/>
-          <w:b/>
-          <w:bCs/>
-        </w:rPr>
-        <w:t xml:space="preserve"> FAE</w:t>
+      <w:r>
+        <w:rPr>
+          <w:rFonts w:ascii="Century Schoolbook" w:hAnsi="Century Schoolbook"/>
+          <w:b/>
+          <w:bCs/>
+        </w:rPr>
+        <w:t>Top-K FAE</w:t>
       </w:r>
       <w:r>
         <w:rPr>
@@ -4458,7 +3999,6 @@
         </w:rPr>
         <w:t xml:space="preserve"> differ fundamentally from </w:t>
       </w:r>
-      <w:proofErr w:type="spellStart"/>
       <w:r>
         <w:rPr>
           <w:rFonts w:ascii="Century Schoolbook" w:hAnsi="Century Schoolbook"/>
@@ -4467,14 +4007,12 @@
         </w:rPr>
         <w:t>minSup</w:t>
       </w:r>
-      <w:proofErr w:type="spellEnd"/>
       <w:r>
         <w:rPr>
           <w:rFonts w:ascii="Century Schoolbook" w:hAnsi="Century Schoolbook"/>
         </w:rPr>
         <w:t xml:space="preserve"> in </w:t>
       </w:r>
-      <w:proofErr w:type="spellStart"/>
       <w:r>
         <w:rPr>
           <w:rFonts w:ascii="Century Schoolbook" w:hAnsi="Century Schoolbook"/>
@@ -4483,7 +4021,6 @@
         </w:rPr>
         <w:t>MaxFPGrowth</w:t>
       </w:r>
-      <w:proofErr w:type="spellEnd"/>
       <w:r>
         <w:rPr>
           <w:rFonts w:ascii="Century Schoolbook" w:hAnsi="Century Schoolbook"/>
@@ -4523,147 +4060,39 @@
           <w:b/>
           <w:bCs/>
         </w:rPr>
-        <w:t>Answer (</w:t>
-      </w:r>
-      <w:proofErr w:type="gramStart"/>
-      <w:r>
-        <w:rPr>
-          <w:rFonts w:ascii="Century Schoolbook" w:hAnsi="Century Schoolbook"/>
-          <w:b/>
-          <w:bCs/>
-        </w:rPr>
-        <w:t>1) —</w:t>
-      </w:r>
-      <w:proofErr w:type="gramEnd"/>
-      <w:r>
-        <w:rPr>
-          <w:rFonts w:ascii="Century Schoolbook" w:hAnsi="Century Schoolbook"/>
-          <w:b/>
-          <w:bCs/>
-        </w:rPr>
-        <w:t xml:space="preserve"> Runtime and pattern count when lowering </w:t>
-      </w:r>
-      <w:proofErr w:type="spellStart"/>
-      <w:r>
-        <w:rPr>
-          <w:rFonts w:ascii="Century Schoolbook" w:hAnsi="Century Schoolbook"/>
-          <w:b/>
-          <w:bCs/>
-        </w:rPr>
-        <w:t>minSup</w:t>
-      </w:r>
-      <w:proofErr w:type="spellEnd"/>
-      <w:r>
-        <w:rPr>
-          <w:rFonts w:ascii="Century Schoolbook" w:hAnsi="Century Schoolbook"/>
-          <w:b/>
-          <w:bCs/>
-        </w:rPr>
-        <w:t>:</w:t>
-      </w:r>
-    </w:p>
-    <w:p>
-      <w:pPr>
-        <w:jc w:val="both"/>
-        <w:rPr>
-          <w:rFonts w:ascii="Century Schoolbook" w:hAnsi="Century Schoolbook"/>
-        </w:rPr>
-      </w:pPr>
-      <w:r>
-        <w:rPr>
-          <w:rFonts w:ascii="Century Schoolbook" w:hAnsi="Century Schoolbook"/>
-          <w:b/>
-          <w:bCs/>
-        </w:rPr>
-        <w:t>Answer (</w:t>
-      </w:r>
-      <w:proofErr w:type="gramStart"/>
-      <w:r>
-        <w:rPr>
-          <w:rFonts w:ascii="Century Schoolbook" w:hAnsi="Century Schoolbook"/>
-          <w:b/>
-          <w:bCs/>
-        </w:rPr>
-        <w:t>2) —</w:t>
-      </w:r>
-      <w:proofErr w:type="gramEnd"/>
-      <w:r>
-        <w:rPr>
-          <w:rFonts w:ascii="Century Schoolbook" w:hAnsi="Century Schoolbook"/>
-          <w:b/>
-          <w:bCs/>
-        </w:rPr>
-        <w:t xml:space="preserve"> Top-K k vs </w:t>
-      </w:r>
-      <w:proofErr w:type="spellStart"/>
-      <w:r>
-        <w:rPr>
-          <w:rFonts w:ascii="Century Schoolbook" w:hAnsi="Century Schoolbook"/>
-          <w:b/>
-          <w:bCs/>
-        </w:rPr>
-        <w:t>MaxFPGrowth</w:t>
-      </w:r>
-      <w:proofErr w:type="spellEnd"/>
-      <w:r>
-        <w:rPr>
-          <w:rFonts w:ascii="Century Schoolbook" w:hAnsi="Century Schoolbook"/>
-          <w:b/>
-          <w:bCs/>
-        </w:rPr>
-        <w:t xml:space="preserve"> </w:t>
-      </w:r>
-      <w:proofErr w:type="spellStart"/>
-      <w:r>
-        <w:rPr>
-          <w:rFonts w:ascii="Century Schoolbook" w:hAnsi="Century Schoolbook"/>
-          <w:b/>
-          <w:bCs/>
-        </w:rPr>
-        <w:t>minSup</w:t>
-      </w:r>
-      <w:proofErr w:type="spellEnd"/>
-      <w:r>
-        <w:rPr>
-          <w:rFonts w:ascii="Century Schoolbook" w:hAnsi="Century Schoolbook"/>
-          <w:b/>
-          <w:bCs/>
-        </w:rPr>
-        <w:t>:</w:t>
-      </w:r>
-    </w:p>
-    <w:p>
-      <w:pPr>
-        <w:jc w:val="both"/>
-        <w:rPr>
-          <w:rFonts w:ascii="Century Schoolbook" w:hAnsi="Century Schoolbook"/>
-        </w:rPr>
-      </w:pPr>
-      <w:r>
-        <w:rPr>
-          <w:rFonts w:ascii="Century Schoolbook" w:hAnsi="Century Schoolbook"/>
-          <w:b/>
-          <w:bCs/>
-        </w:rPr>
-        <w:t>Answer (</w:t>
-      </w:r>
-      <w:proofErr w:type="gramStart"/>
-      <w:r>
-        <w:rPr>
-          <w:rFonts w:ascii="Century Schoolbook" w:hAnsi="Century Schoolbook"/>
-          <w:b/>
-          <w:bCs/>
-        </w:rPr>
-        <w:t>3) —</w:t>
-      </w:r>
-      <w:proofErr w:type="gramEnd"/>
-      <w:r>
-        <w:rPr>
-          <w:rFonts w:ascii="Century Schoolbook" w:hAnsi="Century Schoolbook"/>
-          <w:b/>
-          <w:bCs/>
-        </w:rPr>
-        <w:t xml:space="preserve"> Maximal vs standard frequent patterns:</w:t>
+        <w:t>Answer (1) — Runtime and pattern count when lowering minSup:</w:t>
+      </w:r>
+    </w:p>
+    <w:p>
+      <w:pPr>
+        <w:jc w:val="both"/>
+        <w:rPr>
+          <w:rFonts w:ascii="Century Schoolbook" w:hAnsi="Century Schoolbook"/>
+        </w:rPr>
+      </w:pPr>
+      <w:r>
+        <w:rPr>
+          <w:rFonts w:ascii="Century Schoolbook" w:hAnsi="Century Schoolbook"/>
+          <w:b/>
+          <w:bCs/>
+        </w:rPr>
+        <w:t>Answer (2) — Top-K k vs MaxFPGrowth minSup:</w:t>
+      </w:r>
+    </w:p>
+    <w:p>
+      <w:pPr>
+        <w:jc w:val="both"/>
+        <w:rPr>
+          <w:rFonts w:ascii="Century Schoolbook" w:hAnsi="Century Schoolbook"/>
+        </w:rPr>
+      </w:pPr>
+      <w:r>
+        <w:rPr>
+          <w:rFonts w:ascii="Century Schoolbook" w:hAnsi="Century Schoolbook"/>
+          <w:b/>
+          <w:bCs/>
+        </w:rPr>
+        <w:t>Answer (3) — Maximal vs standard frequent patterns:</w:t>
       </w:r>
     </w:p>
     <w:p>
@@ -4803,6 +4232,7 @@
           <w:b/>
           <w:bCs/>
         </w:rPr>
+        <w:lastRenderedPageBreak/>
         <w:t xml:space="preserve">Task: </w:t>
       </w:r>
       <w:r>
@@ -4811,7 +4241,6 @@
         </w:rPr>
         <w:t xml:space="preserve">After text vectorization, the </w:t>
       </w:r>
-      <w:proofErr w:type="spellStart"/>
       <w:r>
         <w:rPr>
           <w:rFonts w:ascii="Century Schoolbook" w:hAnsi="Century Schoolbook"/>
@@ -4820,7 +4249,6 @@
         </w:rPr>
         <w:t>X_counts</w:t>
       </w:r>
-      <w:proofErr w:type="spellEnd"/>
       <w:r>
         <w:rPr>
           <w:rFonts w:ascii="Century Schoolbook" w:hAnsi="Century Schoolbook"/>
@@ -4862,7 +4290,6 @@
         </w:rPr>
         <w:t xml:space="preserve">If we want to visually map how these documents group by category on a scatter plot, why is it mathematically and visually impossible to plot the raw </w:t>
       </w:r>
-      <w:proofErr w:type="spellStart"/>
       <w:r>
         <w:rPr>
           <w:rFonts w:ascii="Century Schoolbook" w:hAnsi="Century Schoolbook"/>
@@ -4871,7 +4298,6 @@
         </w:rPr>
         <w:t>X_counts</w:t>
       </w:r>
-      <w:proofErr w:type="spellEnd"/>
       <w:r>
         <w:rPr>
           <w:rFonts w:ascii="Century Schoolbook" w:hAnsi="Century Schoolbook"/>
@@ -4949,7 +4375,6 @@
           <w:b/>
           <w:bCs/>
         </w:rPr>
-        <w:lastRenderedPageBreak/>
         <w:t>If yes, how:</w:t>
       </w:r>
       <w:r>
@@ -5423,6 +4848,7 @@
           <w:b/>
           <w:bCs/>
         </w:rPr>
+        <w:lastRenderedPageBreak/>
         <w:t>Notebook:</w:t>
       </w:r>
       <w:r>
@@ -5469,7 +4895,6 @@
         </w:rPr>
         <w:t xml:space="preserve"> (integers 0, 1, 2, 3). Then look at the output of </w:t>
       </w:r>
-      <w:proofErr w:type="spellStart"/>
       <w:r>
         <w:rPr>
           <w:rFonts w:ascii="Century Schoolbook" w:hAnsi="Century Schoolbook"/>
@@ -5478,7 +4903,6 @@
         </w:rPr>
         <w:t>LabelBinarizer</w:t>
       </w:r>
-      <w:proofErr w:type="spellEnd"/>
       <w:r>
         <w:rPr>
           <w:rFonts w:ascii="Century Schoolbook" w:hAnsi="Century Schoolbook"/>

</xml_diff>